<commit_message>
CFA - Síntesis ajustado - repositorio
</commit_message>
<xml_diff>
--- a/fuentes/11220159_CF01_DU.docx
+++ b/fuentes/11220159_CF01_DU.docx
@@ -4,7 +4,7 @@
   <w:body>
     <w:p>
       <w:pPr>
-        <w:ind w:firstLine="1"/>
+        <w:ind w:left="708" w:hanging="707"/>
       </w:pPr>
       <w:r>
         <w:rPr>
@@ -557,7 +557,29 @@
           <w:kern w:val="0"/>
           <w14:ligatures w14:val="none"/>
         </w:rPr>
-        <w:t xml:space="preserve">Junio </w:t>
+        <w:t>J</w:t>
+      </w:r>
+      <w:r>
+        <w:rPr>
+          <w:rFonts w:ascii="Calibri" w:hAnsi="Calibri"/>
+          <w:b/>
+          <w:bCs/>
+          <w:color w:val="000000" w:themeColor="text1"/>
+          <w:kern w:val="0"/>
+          <w14:ligatures w14:val="none"/>
+        </w:rPr>
+        <w:t>ulio</w:t>
+      </w:r>
+      <w:r>
+        <w:rPr>
+          <w:rFonts w:ascii="Calibri" w:hAnsi="Calibri"/>
+          <w:b/>
+          <w:bCs/>
+          <w:color w:val="000000" w:themeColor="text1"/>
+          <w:kern w:val="0"/>
+          <w14:ligatures w14:val="none"/>
+        </w:rPr>
+        <w:t xml:space="preserve"> </w:t>
       </w:r>
       <w:r>
         <w:rPr>
@@ -1656,7 +1678,21 @@
                 <w:rStyle w:val="Hipervnculo"/>
                 <w:noProof/>
               </w:rPr>
-              <w:t>4. Ingeniería de prompts (</w:t>
+              <w:t xml:space="preserve">4. Ingeniería de </w:t>
+            </w:r>
+            <w:r>
+              <w:rPr>
+                <w:rStyle w:val="Extranjerismo"/>
+                <w:noProof/>
+              </w:rPr>
+              <w:t>prompts</w:t>
+            </w:r>
+            <w:r>
+              <w:rPr>
+                <w:rStyle w:val="Hipervnculo"/>
+                <w:noProof/>
+              </w:rPr>
+              <w:t xml:space="preserve"> (</w:t>
             </w:r>
             <w:r>
               <w:rPr>
@@ -2543,20 +2579,26 @@
         <w:rPr>
           <w:lang w:val="es-419" w:eastAsia="es-CO"/>
         </w:rPr>
-        <w:t>La inteligencia artificial generativa (IAG) representa un cambio de paradigma en la interacción entre el lenguaje humano y el computacional, permitiendo la creación de contenido original (texto, imagen, código y voz) mediante sistemas entrenados con volúmenes masivos de datos. En este componente, se analizan los fundamentos técnicos de los modelos de lenguaje de gran escala (LLM), su arquitectura predictiva basada en tokens y la taxonomía de las plataformas líderes en el mercado actual.</w:t>
-      </w:r>
-    </w:p>
-    <w:p>
-      <w:pPr>
-        <w:rPr>
-          <w:lang w:val="es-419" w:eastAsia="es-CO"/>
-        </w:rPr>
-      </w:pPr>
-      <w:r>
-        <w:rPr>
-          <w:lang w:val="es-419" w:eastAsia="es-CO"/>
-        </w:rPr>
-        <w:t xml:space="preserve">La capacidad de utilizar la IAG se ha convertido en una competencia esencial para la innovación y la competitividad en industrias tan diversas como la salud, la manufactura y el desarrollo de </w:t>
+        <w:t>La inteligencia artificial generativa (IAG) representa un cambio de paradigma en la interacción entre el lenguaje humano y el computacional, permitiendo la creación de contenido original (texto, imagen, código y voz) mediante sistemas entrenados con volúmenes masivos de datos. En este componente, se analizan los fundamentos técnicos de los modelos de lenguaje de gran escala (LLM), su arquitectura predictiva basada en y la taxonomía de las plataformas líderes en el mercado actual.</w:t>
+      </w:r>
+    </w:p>
+    <w:p>
+      <w:pPr>
+        <w:rPr>
+          <w:lang w:val="es-419" w:eastAsia="es-CO"/>
+        </w:rPr>
+      </w:pPr>
+      <w:r>
+        <w:rPr>
+          <w:lang w:val="es-419" w:eastAsia="es-CO"/>
+        </w:rPr>
+        <w:t xml:space="preserve">La capacidad de utilizar la IAG se ha convertido en una competencia esencial para la innovación y la competitividad en </w:t>
+      </w:r>
+      <w:r>
+        <w:rPr>
+          <w:lang w:val="es-419" w:eastAsia="es-CO"/>
+        </w:rPr>
+        <w:t xml:space="preserve">sectores como la salud, la manufactura y el desarrollo de </w:t>
       </w:r>
       <w:r>
         <w:rPr>
@@ -2970,11 +3012,19 @@
         <w:rPr>
           <w:lang w:val="es-419" w:eastAsia="es-CO"/>
         </w:rPr>
-        <w:t xml:space="preserve"> Genera contenido original mediante modelos de aprendizaje automático (machine </w:t>
+        <w:t xml:space="preserve"> Genera contenido original mediante modelos de aprendizaje automático (</w:t>
+      </w:r>
+      <w:r>
+        <w:rPr>
+          <w:rStyle w:val="Extranjerismo"/>
+          <w:lang w:val="es-419" w:eastAsia="es-CO"/>
+        </w:rPr>
+        <w:t xml:space="preserve">machine </w:t>
       </w:r>
       <w:proofErr w:type="spellStart"/>
       <w:r>
         <w:rPr>
+          <w:rStyle w:val="Extranjerismo"/>
           <w:lang w:val="es-419" w:eastAsia="es-CO"/>
         </w:rPr>
         <w:t>learning</w:t>
@@ -3152,11 +3202,19 @@
         <w:rPr>
           <w:lang w:val="es-ES" w:eastAsia="es-CO"/>
         </w:rPr>
-        <w:t xml:space="preserve">Sin embargo, la transición hacia la inteligencia artificial generativa (IAG) se ha producido de manera exponencial durante la última década, impulsada por la arquitectura de redes neuronales profundas y la aparición de los modelos de lenguaje de gran escala (Large </w:t>
+        <w:t>Sin embargo, la transición hacia la inteligencia artificial generativa (IAG) se ha producido de manera exponencial durante la última década, impulsada por la arquitectura de redes neuronales profundas y la aparición de los modelos de lenguaje de gran escala (</w:t>
+      </w:r>
+      <w:r>
+        <w:rPr>
+          <w:rStyle w:val="Extranjerismo"/>
+          <w:lang w:val="es-ES" w:eastAsia="es-CO"/>
+        </w:rPr>
+        <w:t xml:space="preserve">Large </w:t>
       </w:r>
       <w:proofErr w:type="spellStart"/>
       <w:r>
         <w:rPr>
+          <w:rStyle w:val="Extranjerismo"/>
           <w:lang w:val="es-ES" w:eastAsia="es-CO"/>
         </w:rPr>
         <w:t>Language</w:t>
@@ -3164,6 +3222,7 @@
       <w:proofErr w:type="spellEnd"/>
       <w:r>
         <w:rPr>
+          <w:rStyle w:val="Extranjerismo"/>
           <w:lang w:val="es-ES" w:eastAsia="es-CO"/>
         </w:rPr>
         <w:t xml:space="preserve"> </w:t>
@@ -3171,6 +3230,7 @@
       <w:proofErr w:type="spellStart"/>
       <w:r>
         <w:rPr>
+          <w:rStyle w:val="Extranjerismo"/>
           <w:lang w:val="es-ES" w:eastAsia="es-CO"/>
         </w:rPr>
         <w:t>Models</w:t>
@@ -3266,7 +3326,31 @@
         <w:rPr>
           <w:lang w:val="es-ES" w:eastAsia="es-CO"/>
         </w:rPr>
-        <w:t>En este contexto, la IAG actúa como un catalizador de la productividad en industrias tan diversas como la salud, el marketing, el derecho y el desarrollo de software. Su capacidad para automatizar procesos cognitivos, optimizar flujos de trabajo y generar contenido especializado está transformando la manera en que las organizaciones producen valor y toman decisiones.</w:t>
+        <w:t xml:space="preserve">En este contexto, la IAG actúa como un catalizador de la productividad en industrias tan diversas como la salud, el </w:t>
+      </w:r>
+      <w:r>
+        <w:rPr>
+          <w:rStyle w:val="Extranjerismo"/>
+        </w:rPr>
+        <w:t>marketing</w:t>
+      </w:r>
+      <w:r>
+        <w:rPr>
+          <w:lang w:val="es-ES" w:eastAsia="es-CO"/>
+        </w:rPr>
+        <w:t xml:space="preserve">, el derecho y el desarrollo de </w:t>
+      </w:r>
+      <w:r>
+        <w:rPr>
+          <w:rStyle w:val="Extranjerismo"/>
+        </w:rPr>
+        <w:t>software</w:t>
+      </w:r>
+      <w:r>
+        <w:rPr>
+          <w:lang w:val="es-ES" w:eastAsia="es-CO"/>
+        </w:rPr>
+        <w:t>. Su capacidad para automatizar procesos cognitivos, optimizar flujos de trabajo y generar contenido especializado está transformando la manera en que las organizaciones producen valor y toman decisiones.</w:t>
       </w:r>
     </w:p>
     <w:p>
@@ -3328,8 +3412,9 @@
       </w:pPr>
       <w:r>
         <w:rPr>
-          <w:rStyle w:val="Ttulo5Car"/>
-          <w:lang w:val="es-ES"/>
+          <w:rStyle w:val="Extranjerismo"/>
+          <w:b/>
+          <w:bCs/>
         </w:rPr>
         <w:t>Marketing</w:t>
       </w:r>
@@ -3442,7 +3527,16 @@
       </w:pPr>
       <w:bookmarkStart w:id="3" w:name="_Toc233390479"/>
       <w:r>
-        <w:t>Arquitectura técnica: tokens y modelos de lenguaje de gran escala (LLM)</w:t>
+        <w:t xml:space="preserve">Arquitectura técnica: </w:t>
+      </w:r>
+      <w:r>
+        <w:rPr>
+          <w:rStyle w:val="Extranjerismo"/>
+        </w:rPr>
+        <w:t>tokens</w:t>
+      </w:r>
+      <w:r>
+        <w:t xml:space="preserve"> y modelos de lenguaje de gran escala (LLM)</w:t>
       </w:r>
       <w:bookmarkEnd w:id="3"/>
     </w:p>
@@ -3733,11 +3827,15 @@
     <w:p>
       <w:pPr>
         <w:rPr>
-          <w:lang w:val="es-419" w:eastAsia="es-CO"/>
-        </w:rPr>
-      </w:pPr>
-      <w:r>
-        <w:rPr>
+          <w:b/>
+          <w:bCs/>
+          <w:lang w:val="es-419" w:eastAsia="es-CO"/>
+        </w:rPr>
+      </w:pPr>
+      <w:r>
+        <w:rPr>
+          <w:b/>
+          <w:bCs/>
           <w:lang w:val="es-419" w:eastAsia="es-CO"/>
         </w:rPr>
         <w:t xml:space="preserve">Ejemplo técnico de </w:t>
@@ -3745,13 +3843,17 @@
       <w:proofErr w:type="spellStart"/>
       <w:r>
         <w:rPr>
-          <w:lang w:val="es-419" w:eastAsia="es-CO"/>
+          <w:rStyle w:val="Extranjerismo"/>
+          <w:b/>
+          <w:bCs/>
         </w:rPr>
         <w:t>tokenización</w:t>
       </w:r>
       <w:proofErr w:type="spellEnd"/>
       <w:r>
         <w:rPr>
+          <w:b/>
+          <w:bCs/>
           <w:lang w:val="es-419" w:eastAsia="es-CO"/>
         </w:rPr>
         <w:t>: optimización en la gestión administrativa y jurídica</w:t>
@@ -3813,7 +3915,19 @@
         <w:rPr>
           <w:lang w:val="es-419" w:eastAsia="es-CO"/>
         </w:rPr>
-        <w:t>Entrada: el sistema recibe el documento convertido en una secuencia masiva de tokens.</w:t>
+        <w:t xml:space="preserve">Entrada: el sistema recibe el documento convertido en una secuencia masiva de </w:t>
+      </w:r>
+      <w:r>
+        <w:rPr>
+          <w:rStyle w:val="Extranjerismo"/>
+        </w:rPr>
+        <w:t>tokens</w:t>
+      </w:r>
+      <w:r>
+        <w:rPr>
+          <w:lang w:val="es-419" w:eastAsia="es-CO"/>
+        </w:rPr>
+        <w:t>.</w:t>
       </w:r>
     </w:p>
     <w:p>
@@ -3832,7 +3946,19 @@
         <w:rPr>
           <w:lang w:val="es-419" w:eastAsia="es-CO"/>
         </w:rPr>
-        <w:t>Análisis de patrones: el LLM identifica la recurrencia de tokens relacionados semánticamente con términos como “sanción”, “incumplimiento” y “plazos”.</w:t>
+        <w:t xml:space="preserve">Análisis de patrones: el LLM identifica la recurrencia de </w:t>
+      </w:r>
+      <w:r>
+        <w:rPr>
+          <w:rStyle w:val="Extranjerismo"/>
+        </w:rPr>
+        <w:t>tokens</w:t>
+      </w:r>
+      <w:r>
+        <w:rPr>
+          <w:lang w:val="es-419" w:eastAsia="es-CO"/>
+        </w:rPr>
+        <w:t xml:space="preserve"> relacionados semánticamente con términos como “sanción”, “incumplimiento” y “plazos”.</w:t>
       </w:r>
     </w:p>
     <w:p>
@@ -3851,7 +3977,19 @@
         <w:rPr>
           <w:lang w:val="es-419" w:eastAsia="es-CO"/>
         </w:rPr>
-        <w:t>Generación de salida: gracias a su arquitectura predictiva, el modelo selecciona los tokens que mejor sintetizan los puntos críticos, manteniendo la fluidez y la terminología técnica requerida.</w:t>
+        <w:t xml:space="preserve">Generación de salida: gracias a su arquitectura predictiva, el modelo selecciona los </w:t>
+      </w:r>
+      <w:r>
+        <w:rPr>
+          <w:rStyle w:val="Extranjerismo"/>
+        </w:rPr>
+        <w:t>tokens</w:t>
+      </w:r>
+      <w:r>
+        <w:rPr>
+          <w:lang w:val="es-419" w:eastAsia="es-CO"/>
+        </w:rPr>
+        <w:t xml:space="preserve"> que mejor sintetizan los puntos críticos, manteniendo la fluidez y la terminología técnica requerida.</w:t>
       </w:r>
     </w:p>
     <w:p>
@@ -3972,10 +4110,9 @@
       <w:pPr>
         <w:pStyle w:val="Prrafodelista"/>
         <w:numPr>
-          <w:ilvl w:val="0"/>
+          <w:ilvl w:val="1"/>
           <w:numId w:val="11"/>
         </w:numPr>
-        <w:ind w:left="993"/>
         <w:rPr>
           <w:lang w:val="es-419" w:eastAsia="es-CO"/>
         </w:rPr>
@@ -3991,6 +4128,30 @@
           <w:lang w:val="es-419" w:eastAsia="es-CO"/>
         </w:rPr>
         <w:t xml:space="preserve"> Estos modelos funcionan como un “imitador avanzado” que predice la siguiente palabra más probable con base en patrones estadísticos. No consultan fuentes en tiempo real; en su lugar, ensamblan texto plausible a partir de lo aprendido durante el entrenamiento.</w:t>
+      </w:r>
+    </w:p>
+    <w:p>
+      <w:pPr>
+        <w:pStyle w:val="Prrafodelista"/>
+        <w:numPr>
+          <w:ilvl w:val="1"/>
+          <w:numId w:val="11"/>
+        </w:numPr>
+        <w:rPr>
+          <w:lang w:val="es-419" w:eastAsia="es-CO"/>
+        </w:rPr>
+      </w:pPr>
+      <w:r>
+        <w:rPr>
+          <w:rStyle w:val="Ttulo5Car"/>
+        </w:rPr>
+        <w:t>Limitación técnica.</w:t>
+      </w:r>
+      <w:r>
+        <w:rPr>
+          <w:lang w:val="es-419" w:eastAsia="es-CO"/>
+        </w:rPr>
+        <w:t xml:space="preserve"> Al tratarse de un sistema de “libro cerrado”, su conocimiento es estático y susceptible a la desactualización. Además, cuando carece de información específica, el modelo tiende a las denominadas “alucinaciones”, generando hechos o referencias inexistentes para mantener la fluidez conversacional.</w:t>
       </w:r>
     </w:p>
     <w:p>
@@ -4007,107 +4168,86 @@
       </w:pPr>
       <w:r>
         <w:rPr>
-          <w:rStyle w:val="Ttulo5Car"/>
-        </w:rPr>
-        <w:t>Limitación técnica.</w:t>
-      </w:r>
-      <w:r>
-        <w:rPr>
-          <w:lang w:val="es-419" w:eastAsia="es-CO"/>
-        </w:rPr>
-        <w:t xml:space="preserve"> Al tratarse de un sistema de “libro cerrado”, su conocimiento es estático y susceptible a la desactualización. Además, cuando carece de información específica, el modelo tiende a las denominadas “alucinaciones”, generando hechos o referencias inexistentes para mantener la fluidez conversacional.</w:t>
+          <w:rStyle w:val="Ttulo3Car"/>
+        </w:rPr>
+        <w:t>IA Consultiva (RAG): el paradigma de "libro abierto".</w:t>
+      </w:r>
+      <w:r>
+        <w:rPr>
+          <w:lang w:val="es-419" w:eastAsia="es-CO"/>
+        </w:rPr>
+        <w:t xml:space="preserve"> La Generación Aumentada por Recuperación (</w:t>
+      </w:r>
+      <w:proofErr w:type="spellStart"/>
+      <w:r>
+        <w:rPr>
+          <w:rStyle w:val="Extranjerismo"/>
+          <w:lang w:val="es-419" w:eastAsia="es-CO"/>
+        </w:rPr>
+        <w:t>Retrieval-Augmented</w:t>
+      </w:r>
+      <w:proofErr w:type="spellEnd"/>
+      <w:r>
+        <w:rPr>
+          <w:rStyle w:val="Extranjerismo"/>
+          <w:lang w:val="es-419" w:eastAsia="es-CO"/>
+        </w:rPr>
+        <w:t xml:space="preserve"> </w:t>
+      </w:r>
+      <w:proofErr w:type="spellStart"/>
+      <w:r>
+        <w:rPr>
+          <w:rStyle w:val="Extranjerismo"/>
+          <w:lang w:val="es-419" w:eastAsia="es-CO"/>
+        </w:rPr>
+        <w:t>Generation</w:t>
+      </w:r>
+      <w:proofErr w:type="spellEnd"/>
+      <w:r>
+        <w:rPr>
+          <w:lang w:val="es-419" w:eastAsia="es-CO"/>
+        </w:rPr>
+        <w:t xml:space="preserve"> [RAG]) representa un cambio de paradigma, ya que desacopla el proceso de generación de lenguaje del almacenamiento de conocimiento factual. En este enfoque, el sistema actúa como un “archivero experto” que investiga antes de </w:t>
+      </w:r>
+      <w:r>
+        <w:rPr>
+          <w:lang w:val="es-419" w:eastAsia="es-CO"/>
+        </w:rPr>
+        <w:lastRenderedPageBreak/>
+        <w:t>construir una respuesta. Sus principales componentes operativos son los siguientes:</w:t>
       </w:r>
     </w:p>
     <w:p>
       <w:pPr>
         <w:pStyle w:val="Prrafodelista"/>
         <w:numPr>
-          <w:ilvl w:val="0"/>
-          <w:numId w:val="11"/>
+          <w:ilvl w:val="1"/>
+          <w:numId w:val="12"/>
         </w:numPr>
-        <w:ind w:left="993"/>
-        <w:rPr>
-          <w:lang w:val="es-419" w:eastAsia="es-CO"/>
-        </w:rPr>
-      </w:pPr>
-      <w:r>
-        <w:rPr>
-          <w:rStyle w:val="Ttulo3Car"/>
-        </w:rPr>
-        <w:t>IA Consultiva (RAG): el paradigma de "libro abierto".</w:t>
-      </w:r>
-      <w:r>
-        <w:rPr>
-          <w:lang w:val="es-419" w:eastAsia="es-CO"/>
-        </w:rPr>
-        <w:t xml:space="preserve"> La Generación Aumentada por Recuperación (</w:t>
-      </w:r>
-      <w:proofErr w:type="spellStart"/>
-      <w:r>
-        <w:rPr>
-          <w:rStyle w:val="Extranjerismo"/>
-          <w:lang w:val="es-419" w:eastAsia="es-CO"/>
-        </w:rPr>
-        <w:t>Retrieval-Augmented</w:t>
-      </w:r>
-      <w:proofErr w:type="spellEnd"/>
-      <w:r>
-        <w:rPr>
-          <w:rStyle w:val="Extranjerismo"/>
-          <w:lang w:val="es-419" w:eastAsia="es-CO"/>
-        </w:rPr>
-        <w:t xml:space="preserve"> </w:t>
-      </w:r>
-      <w:proofErr w:type="spellStart"/>
-      <w:r>
-        <w:rPr>
-          <w:rStyle w:val="Extranjerismo"/>
-          <w:lang w:val="es-419" w:eastAsia="es-CO"/>
-        </w:rPr>
-        <w:t>Generation</w:t>
-      </w:r>
-      <w:proofErr w:type="spellEnd"/>
-      <w:r>
-        <w:rPr>
-          <w:lang w:val="es-419" w:eastAsia="es-CO"/>
-        </w:rPr>
-        <w:t xml:space="preserve"> [RAG]) representa un cambio de paradigma, ya que desacopla el proceso de generación de lenguaje del almacenamiento de conocimiento factual. En este enfoque, el sistema actúa como un “archivero experto” que investiga antes de construir una respuesta. Sus principales componentes operativos son los siguientes:</w:t>
+        <w:rPr>
+          <w:lang w:val="es-419" w:eastAsia="es-CO"/>
+        </w:rPr>
+      </w:pPr>
+      <w:r>
+        <w:rPr>
+          <w:rStyle w:val="Ttulo5Car"/>
+        </w:rPr>
+        <w:t>Mecanismo</w:t>
+      </w:r>
+      <w:r>
+        <w:rPr>
+          <w:lang w:val="es-419" w:eastAsia="es-CO"/>
+        </w:rPr>
+        <w:t>. Ante una consulta, el sistema no inicia generando texto. Primero realiza una búsqueda en un corpus documental externo, curado y autorizado, como bases de datos jurídicas, manuales técnicos empresariales o repositorios científicos. Posteriormente, el LLM sintetiza una respuesta fundamentada estrictamente en las fuentes recuperadas.</w:t>
       </w:r>
     </w:p>
     <w:p>
       <w:pPr>
         <w:pStyle w:val="Prrafodelista"/>
         <w:numPr>
-          <w:ilvl w:val="0"/>
+          <w:ilvl w:val="1"/>
           <w:numId w:val="12"/>
         </w:numPr>
-        <w:ind w:left="993"/>
-        <w:rPr>
-          <w:lang w:val="es-419" w:eastAsia="es-CO"/>
-        </w:rPr>
-      </w:pPr>
-      <w:r>
-        <w:rPr>
-          <w:rStyle w:val="Ttulo5Car"/>
-        </w:rPr>
-        <w:lastRenderedPageBreak/>
-        <w:t>Mecanismo</w:t>
-      </w:r>
-      <w:r>
-        <w:rPr>
-          <w:lang w:val="es-419" w:eastAsia="es-CO"/>
-        </w:rPr>
-        <w:t>. Ante una consulta, el sistema no inicia generando texto. Primero realiza una búsqueda en un corpus documental externo, curado y autorizado, como bases de datos jurídicas, manuales técnicos empresariales o repositorios científicos. Posteriormente, el LLM sintetiza una respuesta fundamentada estrictamente en las fuentes recuperadas.</w:t>
-      </w:r>
-    </w:p>
-    <w:p>
-      <w:pPr>
-        <w:pStyle w:val="Prrafodelista"/>
-        <w:numPr>
-          <w:ilvl w:val="0"/>
-          <w:numId w:val="12"/>
-        </w:numPr>
-        <w:ind w:left="993"/>
         <w:rPr>
           <w:lang w:val="es-419" w:eastAsia="es-CO"/>
         </w:rPr>
@@ -4275,6 +4415,9 @@
             <w:r>
               <w:t>Fluidez y coherencia conversacional</w:t>
             </w:r>
+            <w:r>
+              <w:t>.</w:t>
+            </w:r>
           </w:p>
         </w:tc>
         <w:tc>
@@ -4288,6 +4431,9 @@
             </w:pPr>
             <w:r>
               <w:t>Precisión, fiabilidad y fundamentación</w:t>
+            </w:r>
+            <w:r>
+              <w:t>.</w:t>
             </w:r>
           </w:p>
         </w:tc>
@@ -4322,6 +4468,9 @@
             <w:r>
               <w:t>Paramétrica, interna y estática</w:t>
             </w:r>
+            <w:r>
+              <w:t>.</w:t>
+            </w:r>
           </w:p>
         </w:tc>
         <w:tc>
@@ -4335,6 +4484,9 @@
             </w:pPr>
             <w:r>
               <w:t>Externa, curada y dinámica</w:t>
+            </w:r>
+            <w:r>
+              <w:t>.</w:t>
             </w:r>
           </w:p>
         </w:tc>
@@ -4370,6 +4522,9 @@
             <w:r>
               <w:t>Baja, debido al efecto de “caja negra”</w:t>
             </w:r>
+            <w:r>
+              <w:t>.</w:t>
+            </w:r>
           </w:p>
         </w:tc>
         <w:tc>
@@ -4383,6 +4538,9 @@
             </w:pPr>
             <w:r>
               <w:t>Alta, gracias a la capacidad de citar fuentes</w:t>
+            </w:r>
+            <w:r>
+              <w:t>.</w:t>
             </w:r>
           </w:p>
         </w:tc>
@@ -4417,6 +4575,9 @@
             <w:r>
               <w:t>Alto, por fabricación de hechos “por diseño”</w:t>
             </w:r>
+            <w:r>
+              <w:t>.</w:t>
+            </w:r>
           </w:p>
         </w:tc>
         <w:tc>
@@ -4431,6 +4592,9 @@
             <w:r>
               <w:t>Bajo en fabricación; persiste un riesgo residual de síntesis</w:t>
             </w:r>
+            <w:r>
+              <w:t>.</w:t>
+            </w:r>
           </w:p>
         </w:tc>
       </w:tr>
@@ -4459,6 +4623,7 @@
           <w:rStyle w:val="Ttulo4Car"/>
           <w:lang w:val="es-ES"/>
         </w:rPr>
+        <w:lastRenderedPageBreak/>
         <w:t>Veracidad y trazabilidad en la productividad</w:t>
       </w:r>
       <w:r>
@@ -4471,14 +4636,7 @@
         <w:rPr>
           <w:lang w:val="es-ES" w:eastAsia="es-CO"/>
         </w:rPr>
-        <w:t xml:space="preserve"> En el sector productivo, la diferencia entre ambos paradigmas resulta crítica para la toma de decisiones. </w:t>
-      </w:r>
-      <w:r>
-        <w:rPr>
-          <w:lang w:val="es-ES" w:eastAsia="es-CO"/>
-        </w:rPr>
-        <w:lastRenderedPageBreak/>
-        <w:t>La capacidad de verificar la procedencia de la información puede determinar la confiabilidad de procesos administrativos, jurídicos o industriales. En el siguiente escenario aplicado, se requiere identificar la última actualización de un protocolo de seguridad industrial:</w:t>
+        <w:t xml:space="preserve"> En el sector productivo, la diferencia entre ambos paradigmas resulta crítica para la toma de decisiones. La capacidad de verificar la procedencia de la información puede determinar la confiabilidad de procesos administrativos, jurídicos o industriales. En el siguiente escenario aplicado, se requiere identificar la última actualización de un protocolo de seguridad industrial:</w:t>
       </w:r>
     </w:p>
     <w:p>
@@ -4578,7 +4736,19 @@
         <w:rPr>
           <w:lang w:val="es-419" w:eastAsia="es-CO"/>
         </w:rPr>
-        <w:t>La implementación de soluciones basadas en inteligencia artificial generativa (IAG) en el sector productivo trasciende la simple interacción con un chat. Este proceso requiere una arquitectura robusta que garantice escalabilidad, seguridad y procesamiento eficiente de grandes volúmenes de datos.</w:t>
+        <w:t xml:space="preserve">La implementación de soluciones basadas en inteligencia artificial generativa (IAG) en el sector productivo trasciende la simple interacción con un </w:t>
+      </w:r>
+      <w:r>
+        <w:rPr>
+          <w:rStyle w:val="Extranjerismo"/>
+        </w:rPr>
+        <w:t>chat</w:t>
+      </w:r>
+      <w:r>
+        <w:rPr>
+          <w:lang w:val="es-419" w:eastAsia="es-CO"/>
+        </w:rPr>
+        <w:t>. Este proceso requiere una arquitectura robusta que garantice escalabilidad, seguridad y procesamiento eficiente de grandes volúmenes de datos.</w:t>
       </w:r>
     </w:p>
     <w:p>
@@ -4716,7 +4886,19 @@
         <w:rPr>
           <w:rStyle w:val="Ttulo5Car"/>
         </w:rPr>
-        <w:t xml:space="preserve"> (IaaS - </w:t>
+        <w:t xml:space="preserve"> (IaaS</w:t>
+      </w:r>
+      <w:r>
+        <w:rPr>
+          <w:rStyle w:val="Ttulo5Car"/>
+        </w:rPr>
+        <w:t>:</w:t>
+      </w:r>
+      <w:r>
+        <w:rPr>
+          <w:rStyle w:val="Ttulo5Car"/>
+        </w:rPr>
+        <w:t xml:space="preserve"> </w:t>
       </w:r>
       <w:proofErr w:type="spellStart"/>
       <w:r>
@@ -4748,7 +4930,97 @@
         <w:rPr>
           <w:lang w:val="es-419" w:eastAsia="es-CO"/>
         </w:rPr>
-        <w:t xml:space="preserve"> El modelo IaaS proporciona los recursos de hardware subyacentes necesarios para entrenar, ajustar o desplegar modelos de lenguaje de gran escala. En un nivel técnico avanzado, es fundamental comprender que el “motor” de la IAG no opera sobre unidades centrales de procesamiento (CPU) convencionales, sino sobre hardware especializado en cálculo paralelo masivo. A continuación, se describen los principales componentes de esta infraestructura:</w:t>
+        <w:t xml:space="preserve"> El modelo IaaS proporciona los recursos de </w:t>
+      </w:r>
+      <w:r>
+        <w:rPr>
+          <w:rStyle w:val="Extranjerismo"/>
+        </w:rPr>
+        <w:t>hardware</w:t>
+      </w:r>
+      <w:r>
+        <w:rPr>
+          <w:lang w:val="es-419" w:eastAsia="es-CO"/>
+        </w:rPr>
+        <w:t xml:space="preserve"> subyacentes necesarios para entrenar, ajustar o desplegar modelos de lenguaje de gran escala. En un nivel técnico avanzado, es fundamental comprender que el “motor” de la IAG no opera sobre unidades centrales de procesamiento (CPU) convencionales, sino sobre hardware especializado en cálculo paralelo masivo. A continuación, se describen los principales componentes de esta infraestructura:</w:t>
+      </w:r>
+    </w:p>
+    <w:p>
+      <w:pPr>
+        <w:pStyle w:val="Prrafodelista"/>
+        <w:numPr>
+          <w:ilvl w:val="1"/>
+          <w:numId w:val="14"/>
+        </w:numPr>
+        <w:rPr>
+          <w:lang w:val="es-419" w:eastAsia="es-CO"/>
+        </w:rPr>
+      </w:pPr>
+      <w:r>
+        <w:rPr>
+          <w:rStyle w:val="Ttulo5Car"/>
+        </w:rPr>
+        <w:t>Unidades de procesamiento (GPU y TPU).</w:t>
+      </w:r>
+      <w:r>
+        <w:rPr>
+          <w:lang w:val="es-419" w:eastAsia="es-CO"/>
+        </w:rPr>
+        <w:t xml:space="preserve"> La infraestructura se apoya en Unidades de Procesamiento Gráfico (GPU), como las arquitecturas H100 de NVIDIA, y en Unidades de Procesamiento de Tensores (TPU) de Google. Estos componentes están diseñados para optimizar operaciones matriciales complejas propias de las redes neuronales profundas.</w:t>
+      </w:r>
+    </w:p>
+    <w:p>
+      <w:pPr>
+        <w:pStyle w:val="Prrafodelista"/>
+        <w:numPr>
+          <w:ilvl w:val="1"/>
+          <w:numId w:val="14"/>
+        </w:numPr>
+        <w:rPr>
+          <w:lang w:val="es-419" w:eastAsia="es-CO"/>
+        </w:rPr>
+      </w:pPr>
+      <w:r>
+        <w:rPr>
+          <w:rStyle w:val="Ttulo5Car"/>
+        </w:rPr>
+        <w:t>Almacenamiento vectorial.</w:t>
+      </w:r>
+      <w:r>
+        <w:rPr>
+          <w:lang w:val="es-419" w:eastAsia="es-CO"/>
+        </w:rPr>
+        <w:t xml:space="preserve"> Las implementaciones empresariales incorporan bases de datos vectoriales, como FAISS, </w:t>
+      </w:r>
+      <w:proofErr w:type="spellStart"/>
+      <w:r>
+        <w:rPr>
+          <w:lang w:val="es-419" w:eastAsia="es-CO"/>
+        </w:rPr>
+        <w:t>Qdrant</w:t>
+      </w:r>
+      <w:proofErr w:type="spellEnd"/>
+      <w:r>
+        <w:rPr>
+          <w:lang w:val="es-419" w:eastAsia="es-CO"/>
+        </w:rPr>
+        <w:t xml:space="preserve"> o Chroma. Estas tecnologías permiten almacenar e indexar </w:t>
+      </w:r>
+      <w:proofErr w:type="spellStart"/>
+      <w:r>
+        <w:rPr>
+          <w:rStyle w:val="Extranjerismo"/>
+          <w:lang w:val="es-419" w:eastAsia="es-CO"/>
+        </w:rPr>
+        <w:lastRenderedPageBreak/>
+        <w:t>embeddings</w:t>
+      </w:r>
+      <w:proofErr w:type="spellEnd"/>
+      <w:r>
+        <w:rPr>
+          <w:lang w:val="es-419" w:eastAsia="es-CO"/>
+        </w:rPr>
+        <w:t>, es decir, representaciones numéricas del significado semántico de la información.</w:t>
       </w:r>
     </w:p>
     <w:p>
@@ -4767,13 +5039,28 @@
         <w:rPr>
           <w:rStyle w:val="Ttulo5Car"/>
         </w:rPr>
-        <w:t>Unidades de procesamiento (GPU y TPU).</w:t>
-      </w:r>
-      <w:r>
-        <w:rPr>
-          <w:lang w:val="es-419" w:eastAsia="es-CO"/>
-        </w:rPr>
-        <w:t xml:space="preserve"> La infraestructura se apoya en Unidades de Procesamiento Gráfico (GPU), como las arquitecturas H100 de NVIDIA, y en Unidades de Procesamiento de Tensores (TPU) de Google. Estos componentes están diseñados para optimizar operaciones matriciales complejas propias de las redes neuronales profundas.</w:t>
+        <w:t>Redes de alta velocidad.</w:t>
+      </w:r>
+      <w:r>
+        <w:rPr>
+          <w:lang w:val="es-419" w:eastAsia="es-CO"/>
+        </w:rPr>
+        <w:t xml:space="preserve"> El entrenamiento distribuido y el despliegue de modelos masivos requieren interconectividad de baja latencia, como </w:t>
+      </w:r>
+      <w:proofErr w:type="spellStart"/>
+      <w:r>
+        <w:rPr>
+          <w:rStyle w:val="Extranjerismo"/>
+          <w:lang w:val="es-419" w:eastAsia="es-CO"/>
+        </w:rPr>
+        <w:t>InfiniBand</w:t>
+      </w:r>
+      <w:proofErr w:type="spellEnd"/>
+      <w:r>
+        <w:rPr>
+          <w:lang w:val="es-419" w:eastAsia="es-CO"/>
+        </w:rPr>
+        <w:t>, para sincronizar parámetros entre múltiples nodos de cómputo.</w:t>
       </w:r>
     </w:p>
     <w:p>
@@ -4792,100 +5079,6 @@
         <w:rPr>
           <w:rStyle w:val="Ttulo5Car"/>
         </w:rPr>
-        <w:t>Almacenamiento vectorial.</w:t>
-      </w:r>
-      <w:r>
-        <w:rPr>
-          <w:lang w:val="es-419" w:eastAsia="es-CO"/>
-        </w:rPr>
-        <w:t xml:space="preserve"> Las implementaciones empresariales incorporan bases de datos vectoriales, como FAISS, </w:t>
-      </w:r>
-      <w:proofErr w:type="spellStart"/>
-      <w:r>
-        <w:rPr>
-          <w:lang w:val="es-419" w:eastAsia="es-CO"/>
-        </w:rPr>
-        <w:t>Qdrant</w:t>
-      </w:r>
-      <w:proofErr w:type="spellEnd"/>
-      <w:r>
-        <w:rPr>
-          <w:lang w:val="es-419" w:eastAsia="es-CO"/>
-        </w:rPr>
-        <w:t xml:space="preserve"> o Chroma. Estas tecnologías permiten almacenar e indexar </w:t>
-      </w:r>
-      <w:proofErr w:type="spellStart"/>
-      <w:r>
-        <w:rPr>
-          <w:rStyle w:val="Extranjerismo"/>
-          <w:lang w:val="es-419" w:eastAsia="es-CO"/>
-        </w:rPr>
-        <w:t>embeddings</w:t>
-      </w:r>
-      <w:proofErr w:type="spellEnd"/>
-      <w:r>
-        <w:rPr>
-          <w:lang w:val="es-419" w:eastAsia="es-CO"/>
-        </w:rPr>
-        <w:t>, es decir, representaciones numéricas del significado semántico de la información.</w:t>
-      </w:r>
-    </w:p>
-    <w:p>
-      <w:pPr>
-        <w:pStyle w:val="Prrafodelista"/>
-        <w:numPr>
-          <w:ilvl w:val="0"/>
-          <w:numId w:val="14"/>
-        </w:numPr>
-        <w:ind w:left="993"/>
-        <w:rPr>
-          <w:lang w:val="es-419" w:eastAsia="es-CO"/>
-        </w:rPr>
-      </w:pPr>
-      <w:r>
-        <w:rPr>
-          <w:rStyle w:val="Ttulo5Car"/>
-        </w:rPr>
-        <w:lastRenderedPageBreak/>
-        <w:t>Redes de alta velocidad.</w:t>
-      </w:r>
-      <w:r>
-        <w:rPr>
-          <w:lang w:val="es-419" w:eastAsia="es-CO"/>
-        </w:rPr>
-        <w:t xml:space="preserve"> El entrenamiento distribuido y el despliegue de modelos masivos requieren interconectividad de baja latencia, como </w:t>
-      </w:r>
-      <w:proofErr w:type="spellStart"/>
-      <w:r>
-        <w:rPr>
-          <w:lang w:val="es-419" w:eastAsia="es-CO"/>
-        </w:rPr>
-        <w:t>InfiniBand</w:t>
-      </w:r>
-      <w:proofErr w:type="spellEnd"/>
-      <w:r>
-        <w:rPr>
-          <w:lang w:val="es-419" w:eastAsia="es-CO"/>
-        </w:rPr>
-        <w:t>, para sincronizar parámetros entre múltiples nodos de cómputo.</w:t>
-      </w:r>
-    </w:p>
-    <w:p>
-      <w:pPr>
-        <w:pStyle w:val="Prrafodelista"/>
-        <w:numPr>
-          <w:ilvl w:val="0"/>
-          <w:numId w:val="14"/>
-        </w:numPr>
-        <w:ind w:left="993"/>
-        <w:rPr>
-          <w:lang w:val="es-419" w:eastAsia="es-CO"/>
-        </w:rPr>
-      </w:pPr>
-      <w:r>
-        <w:rPr>
-          <w:rStyle w:val="Ttulo5Car"/>
-        </w:rPr>
         <w:t>Gobernanza y privacidad.</w:t>
       </w:r>
       <w:r>
@@ -4975,7 +5168,15 @@
           <w:bCs/>
           <w:lang w:val="en-US" w:eastAsia="es-CO"/>
         </w:rPr>
-        <w:t xml:space="preserve"> (SaaS </w:t>
+        <w:t xml:space="preserve"> (SaaS</w:t>
+      </w:r>
+      <w:r>
+        <w:rPr>
+          <w:b/>
+          <w:bCs/>
+          <w:lang w:val="en-US" w:eastAsia="es-CO"/>
+        </w:rPr>
+        <w:t>:</w:t>
       </w:r>
       <w:r>
         <w:rPr>
@@ -4984,7 +5185,7 @@
           <w:bCs/>
           <w:lang w:eastAsia="es-CO"/>
         </w:rPr>
-        <w:t>- Software as a Service</w:t>
+        <w:t xml:space="preserve"> Software as a Service</w:t>
       </w:r>
       <w:r>
         <w:rPr>
@@ -5004,30 +5205,38 @@
         <w:rPr>
           <w:lang w:val="es-419" w:eastAsia="es-CO"/>
         </w:rPr>
-        <w:t>El modelo SaaS permite al sector productivo acceder a capacidades avanzadas de inteligencia artificial generativa (IAG) sin necesidad de gestionar infraestructura física ni administrar el ciclo de vida del hardware. Este enfoque democratiza el acceso a la tecnología mediante interfaces listas para el usuario final o mediante interfaces de programación de aplicaciones (</w:t>
-      </w:r>
-      <w:proofErr w:type="spellStart"/>
-      <w:r>
-        <w:rPr>
-          <w:lang w:val="es-419" w:eastAsia="es-CO"/>
-        </w:rPr>
-        <w:t>Application</w:t>
-      </w:r>
-      <w:proofErr w:type="spellEnd"/>
-      <w:r>
-        <w:rPr>
-          <w:lang w:val="es-419" w:eastAsia="es-CO"/>
-        </w:rPr>
-        <w:t xml:space="preserve"> </w:t>
-      </w:r>
-      <w:proofErr w:type="spellStart"/>
-      <w:r>
-        <w:rPr>
-          <w:lang w:val="es-419" w:eastAsia="es-CO"/>
-        </w:rPr>
-        <w:t>Programming</w:t>
-      </w:r>
-      <w:proofErr w:type="spellEnd"/>
+        <w:t xml:space="preserve">El modelo SaaS permite al sector productivo acceder a capacidades avanzadas de inteligencia artificial generativa (IAG) sin necesidad de gestionar infraestructura física ni administrar el ciclo de vida del </w:t>
+      </w:r>
+      <w:r>
+        <w:rPr>
+          <w:rStyle w:val="Extranjerismo"/>
+        </w:rPr>
+        <w:t>hardware</w:t>
+      </w:r>
+      <w:r>
+        <w:rPr>
+          <w:lang w:val="es-419" w:eastAsia="es-CO"/>
+        </w:rPr>
+        <w:t xml:space="preserve">. Este enfoque democratiza el acceso a la tecnología mediante interfaces listas para el usuario final o mediante </w:t>
+      </w:r>
+      <w:r>
+        <w:rPr>
+          <w:rStyle w:val="Extranjerismo"/>
+        </w:rPr>
+        <w:t>interfaces</w:t>
+      </w:r>
+      <w:r>
+        <w:rPr>
+          <w:lang w:val="es-419" w:eastAsia="es-CO"/>
+        </w:rPr>
+        <w:t xml:space="preserve"> de programación de aplicaciones (</w:t>
+      </w:r>
+      <w:r>
+        <w:rPr>
+          <w:rStyle w:val="Extranjerismo"/>
+        </w:rPr>
+        <w:t>Application Programming</w:t>
+      </w:r>
       <w:r>
         <w:rPr>
           <w:lang w:val="es-419" w:eastAsia="es-CO"/>
@@ -5682,7 +5891,20 @@
         <w:rPr>
           <w:lang w:val="es-419" w:eastAsia="es-CO"/>
         </w:rPr>
-        <w:t>La clasificación de las herramientas de IAG se fundamenta en su capacidad para procesar y generar distintas modalidades de datos, es decir, según la naturaleza del output. Aunque las plataformas más reconocidas operan mediante modelos de lenguaje de gran escala (</w:t>
+        <w:t xml:space="preserve">La clasificación de las herramientas de IAG se fundamenta en su capacidad para procesar y generar distintas modalidades de datos, es decir, según la naturaleza del </w:t>
+      </w:r>
+      <w:r>
+        <w:rPr>
+          <w:rStyle w:val="Extranjerismo"/>
+          <w:lang w:val="es-419" w:eastAsia="es-CO"/>
+        </w:rPr>
+        <w:t>output</w:t>
+      </w:r>
+      <w:r>
+        <w:rPr>
+          <w:lang w:val="es-419" w:eastAsia="es-CO"/>
+        </w:rPr>
+        <w:t>. Aunque las plataformas más reconocidas operan mediante modelos de lenguaje de gran escala (</w:t>
       </w:r>
       <w:r>
         <w:rPr>
@@ -5734,44 +5956,45 @@
       <w:r>
         <w:t xml:space="preserve">Generadores de texto (LLM y </w:t>
       </w:r>
+      <w:r>
+        <w:rPr>
+          <w:rStyle w:val="Extranjerismo"/>
+        </w:rPr>
+        <w:t>chatbots</w:t>
+      </w:r>
+      <w:r>
+        <w:t>)</w:t>
+      </w:r>
+    </w:p>
+    <w:p>
+      <w:pPr>
+        <w:rPr>
+          <w:lang w:val="es-419" w:eastAsia="es-CO"/>
+        </w:rPr>
+      </w:pPr>
+      <w:r>
+        <w:rPr>
+          <w:lang w:val="es-419" w:eastAsia="es-CO"/>
+        </w:rPr>
+        <w:t>Especializados en Procesamiento de Lenguaje Natural (</w:t>
+      </w:r>
+      <w:r>
+        <w:rPr>
+          <w:rStyle w:val="Extranjerismo"/>
+          <w:lang w:val="es-419" w:eastAsia="es-CO"/>
+        </w:rPr>
+        <w:t xml:space="preserve">Natural </w:t>
+      </w:r>
       <w:proofErr w:type="spellStart"/>
       <w:r>
-        <w:t>chatbots</w:t>
+        <w:rPr>
+          <w:rStyle w:val="Extranjerismo"/>
+          <w:lang w:val="es-419" w:eastAsia="es-CO"/>
+        </w:rPr>
+        <w:t>Language</w:t>
       </w:r>
       <w:proofErr w:type="spellEnd"/>
       <w:r>
-        <w:t>)</w:t>
-      </w:r>
-    </w:p>
-    <w:p>
-      <w:pPr>
-        <w:rPr>
-          <w:lang w:val="es-419" w:eastAsia="es-CO"/>
-        </w:rPr>
-      </w:pPr>
-      <w:r>
-        <w:rPr>
-          <w:lang w:val="es-419" w:eastAsia="es-CO"/>
-        </w:rPr>
-        <w:t>Especializados en Procesamiento de Lenguaje Natural (</w:t>
-      </w:r>
-      <w:r>
-        <w:rPr>
-          <w:rStyle w:val="Extranjerismo"/>
-          <w:lang w:val="es-419" w:eastAsia="es-CO"/>
-        </w:rPr>
-        <w:t xml:space="preserve">Natural </w:t>
-      </w:r>
-      <w:proofErr w:type="spellStart"/>
-      <w:r>
-        <w:rPr>
-          <w:rStyle w:val="Extranjerismo"/>
-          <w:lang w:val="es-419" w:eastAsia="es-CO"/>
-        </w:rPr>
-        <w:t>Language</w:t>
-      </w:r>
-      <w:proofErr w:type="spellEnd"/>
-      <w:r>
         <w:rPr>
           <w:rStyle w:val="Extranjerismo"/>
           <w:lang w:val="es-419" w:eastAsia="es-CO"/>
@@ -5782,7 +6005,19 @@
         <w:rPr>
           <w:lang w:val="es-419" w:eastAsia="es-CO"/>
         </w:rPr>
-        <w:t xml:space="preserve"> [NLP]). Estas plataformas constituyen el núcleo de la interacción humano-máquina contemporánea, ya que generan respuestas coherentes mediante la predicción probabilística de tokens.</w:t>
+        <w:t xml:space="preserve"> [NLP]). Estas plataformas constituyen el núcleo de la interacción humano-máquina contemporánea, ya que generan respuestas coherentes mediante la predicción probabilística de </w:t>
+      </w:r>
+      <w:r>
+        <w:rPr>
+          <w:rStyle w:val="Extranjerismo"/>
+        </w:rPr>
+        <w:t>tokens</w:t>
+      </w:r>
+      <w:r>
+        <w:rPr>
+          <w:lang w:val="es-419" w:eastAsia="es-CO"/>
+        </w:rPr>
+        <w:t>.</w:t>
       </w:r>
     </w:p>
     <w:p>
@@ -5958,7 +6193,19 @@
         <w:rPr>
           <w:lang w:val="es-419" w:eastAsia="es-CO"/>
         </w:rPr>
-        <w:t>Son herramientas optimizadas para el desarrollo de software. Permiten generar funciones completas, realizar depuración de errores (</w:t>
+        <w:t xml:space="preserve">Son herramientas optimizadas para el desarrollo de </w:t>
+      </w:r>
+      <w:r>
+        <w:rPr>
+          <w:rStyle w:val="Extranjerismo"/>
+        </w:rPr>
+        <w:t>software</w:t>
+      </w:r>
+      <w:r>
+        <w:rPr>
+          <w:lang w:val="es-419" w:eastAsia="es-CO"/>
+        </w:rPr>
+        <w:t>. Permiten generar funciones completas, realizar depuración de errores (</w:t>
       </w:r>
       <w:proofErr w:type="spellStart"/>
       <w:r>
@@ -6250,13 +6497,6 @@
     </w:p>
     <w:p>
       <w:pPr>
-        <w:rPr>
-          <w:lang w:val="es-419" w:eastAsia="es-CO"/>
-        </w:rPr>
-      </w:pPr>
-    </w:p>
-    <w:p>
-      <w:pPr>
         <w:pStyle w:val="Ttulo2"/>
       </w:pPr>
       <w:bookmarkStart w:id="8" w:name="_Toc233390484"/>
@@ -6335,10 +6575,9 @@
       <w:pPr>
         <w:pStyle w:val="Prrafodelista"/>
         <w:numPr>
-          <w:ilvl w:val="0"/>
+          <w:ilvl w:val="1"/>
           <w:numId w:val="16"/>
         </w:numPr>
-        <w:ind w:left="993"/>
         <w:rPr>
           <w:lang w:val="es-419" w:eastAsia="es-CO"/>
         </w:rPr>
@@ -6382,10 +6621,9 @@
       <w:pPr>
         <w:pStyle w:val="Prrafodelista"/>
         <w:numPr>
-          <w:ilvl w:val="0"/>
+          <w:ilvl w:val="1"/>
           <w:numId w:val="16"/>
         </w:numPr>
-        <w:ind w:left="993"/>
         <w:rPr>
           <w:lang w:val="es-419" w:eastAsia="es-CO"/>
         </w:rPr>
@@ -6424,10 +6662,9 @@
       <w:pPr>
         <w:pStyle w:val="Prrafodelista"/>
         <w:numPr>
-          <w:ilvl w:val="0"/>
+          <w:ilvl w:val="1"/>
           <w:numId w:val="16"/>
         </w:numPr>
-        <w:ind w:left="993"/>
         <w:rPr>
           <w:lang w:val="es-419" w:eastAsia="es-CO"/>
         </w:rPr>
@@ -6449,10 +6686,9 @@
       <w:pPr>
         <w:pStyle w:val="Prrafodelista"/>
         <w:numPr>
-          <w:ilvl w:val="0"/>
+          <w:ilvl w:val="1"/>
           <w:numId w:val="16"/>
         </w:numPr>
-        <w:ind w:left="993"/>
         <w:rPr>
           <w:lang w:val="es-419" w:eastAsia="es-CO"/>
         </w:rPr>
@@ -6482,10 +6718,9 @@
       <w:pPr>
         <w:pStyle w:val="Prrafodelista"/>
         <w:numPr>
-          <w:ilvl w:val="0"/>
+          <w:ilvl w:val="1"/>
           <w:numId w:val="16"/>
         </w:numPr>
-        <w:ind w:left="993"/>
         <w:rPr>
           <w:lang w:val="es-419" w:eastAsia="es-CO"/>
         </w:rPr>
@@ -6747,7 +6982,7 @@
           <w:noProof/>
         </w:rPr>
         <w:drawing>
-          <wp:inline distT="0" distB="0" distL="0" distR="0" wp14:anchorId="4E1BDDBA" wp14:editId="2C50D100">
+          <wp:inline distT="0" distB="0" distL="0" distR="0" wp14:anchorId="4E1BDDBA" wp14:editId="31AE6C6E">
             <wp:extent cx="4680000" cy="2632500"/>
             <wp:effectExtent l="0" t="0" r="6350" b="0"/>
             <wp:docPr id="10" name="Imagen 10">
@@ -6819,21 +7054,7 @@
             <w:rStyle w:val="Hipervnculo"/>
             <w:b/>
           </w:rPr>
-          <w:t>Enlace de reprod</w:t>
-        </w:r>
-        <w:r>
-          <w:rPr>
-            <w:rStyle w:val="Hipervnculo"/>
-            <w:b/>
-          </w:rPr>
-          <w:t>u</w:t>
-        </w:r>
-        <w:r>
-          <w:rPr>
-            <w:rStyle w:val="Hipervnculo"/>
-            <w:b/>
-          </w:rPr>
-          <w:t>cción del video</w:t>
+          <w:t>Enlace de reproducción del video</w:t>
         </w:r>
       </w:hyperlink>
     </w:p>
@@ -6905,7 +7126,16 @@
           </w:p>
           <w:p>
             <w:r>
-              <w:t>En el sector de servicios y marketing, estas tecnologías facilitan la personalización de experiencias de usuario mediante el análisis de preferencias y comportamientos.</w:t>
+              <w:t xml:space="preserve">En el sector de servicios y </w:t>
+            </w:r>
+            <w:r>
+              <w:rPr>
+                <w:rStyle w:val="Extranjerismo"/>
+              </w:rPr>
+              <w:t>marketing</w:t>
+            </w:r>
+            <w:r>
+              <w:t>, estas tecnologías facilitan la personalización de experiencias de usuario mediante el análisis de preferencias y comportamientos.</w:t>
             </w:r>
           </w:p>
           <w:p>
@@ -6957,11 +7187,15 @@
     <w:p>
       <w:pPr>
         <w:rPr>
-          <w:lang w:val="es-419" w:eastAsia="es-CO"/>
-        </w:rPr>
-      </w:pPr>
-      <w:r>
-        <w:rPr>
+          <w:b/>
+          <w:bCs/>
+          <w:lang w:val="es-419" w:eastAsia="es-CO"/>
+        </w:rPr>
+      </w:pPr>
+      <w:r>
+        <w:rPr>
+          <w:b/>
+          <w:bCs/>
           <w:lang w:val="es-419" w:eastAsia="es-CO"/>
         </w:rPr>
         <w:t xml:space="preserve">Caso de uso: selección de plataforma para el desarrollo de </w:t>
@@ -6969,6 +7203,8 @@
       <w:r>
         <w:rPr>
           <w:rStyle w:val="Extranjerismo"/>
+          <w:b/>
+          <w:bCs/>
           <w:lang w:val="es-419" w:eastAsia="es-CO"/>
         </w:rPr>
         <w:t>software</w:t>
@@ -7037,42 +7273,12 @@
         </w:rPr>
         <w:t>Se descarta el uso de modelos de propósito general sin integración con entornos de desarrollo integrados (</w:t>
       </w:r>
-      <w:proofErr w:type="spellStart"/>
-      <w:r>
-        <w:rPr>
-          <w:lang w:val="es-419" w:eastAsia="es-CO"/>
-        </w:rPr>
-        <w:t>Integrated</w:t>
-      </w:r>
-      <w:proofErr w:type="spellEnd"/>
-      <w:r>
-        <w:rPr>
-          <w:lang w:val="es-419" w:eastAsia="es-CO"/>
-        </w:rPr>
-        <w:t xml:space="preserve"> </w:t>
-      </w:r>
-      <w:proofErr w:type="spellStart"/>
-      <w:r>
-        <w:rPr>
-          <w:lang w:val="es-419" w:eastAsia="es-CO"/>
-        </w:rPr>
-        <w:t>Development</w:t>
-      </w:r>
-      <w:proofErr w:type="spellEnd"/>
-      <w:r>
-        <w:rPr>
-          <w:lang w:val="es-419" w:eastAsia="es-CO"/>
-        </w:rPr>
-        <w:t xml:space="preserve"> </w:t>
-      </w:r>
-      <w:proofErr w:type="spellStart"/>
-      <w:r>
-        <w:rPr>
-          <w:lang w:val="es-419" w:eastAsia="es-CO"/>
-        </w:rPr>
-        <w:t>Environments</w:t>
-      </w:r>
-      <w:proofErr w:type="spellEnd"/>
+      <w:r>
+        <w:rPr>
+          <w:rStyle w:val="Extranjerismo"/>
+        </w:rPr>
+        <w:t>Integrated Development Environments</w:t>
+      </w:r>
       <w:r>
         <w:rPr>
           <w:lang w:val="es-419" w:eastAsia="es-CO"/>
@@ -7419,7 +7625,19 @@
           <w:lang w:val="es-419" w:eastAsia="es-CO"/>
         </w:rPr>
         <w:lastRenderedPageBreak/>
-        <w:t>como administrador, editor y usuario final para controlar recursos, acciones permitidas y acceso a registros de actividad (logs).</w:t>
+        <w:t>como administrador, editor y usuario final para controlar recursos, acciones permitidas y acceso a registros de actividad (</w:t>
+      </w:r>
+      <w:r>
+        <w:rPr>
+          <w:rStyle w:val="Extranjerismo"/>
+        </w:rPr>
+        <w:t>logs</w:t>
+      </w:r>
+      <w:r>
+        <w:rPr>
+          <w:lang w:val="es-419" w:eastAsia="es-CO"/>
+        </w:rPr>
+        <w:t>).</w:t>
       </w:r>
     </w:p>
     <w:p>
@@ -7593,19 +7811,11 @@
           <w:lang w:val="es-419" w:eastAsia="es-CO"/>
         </w:rPr>
       </w:pPr>
-      <w:proofErr w:type="spellStart"/>
       <w:r>
         <w:rPr>
           <w:rStyle w:val="Ttulo5Car"/>
         </w:rPr>
-        <w:t>Anonimización</w:t>
-      </w:r>
-      <w:proofErr w:type="spellEnd"/>
-      <w:r>
-        <w:rPr>
-          <w:rStyle w:val="Ttulo5Car"/>
-        </w:rPr>
-        <w:t xml:space="preserve"> proactiva. </w:t>
+        <w:t xml:space="preserve">Anonimización proactiva. </w:t>
       </w:r>
       <w:r>
         <w:rPr>
@@ -8034,27 +8244,33 @@
       </w:r>
       <w:r>
         <w:rPr>
-          <w:lang w:val="es-419" w:eastAsia="es-CO"/>
+          <w:rStyle w:val="Extranjerismo"/>
         </w:rPr>
         <w:t>h</w:t>
       </w:r>
       <w:r>
         <w:rPr>
-          <w:lang w:val="es-419" w:eastAsia="es-CO"/>
+          <w:rStyle w:val="Extranjerismo"/>
         </w:rPr>
         <w:t xml:space="preserve">abeas </w:t>
       </w:r>
       <w:r>
         <w:rPr>
-          <w:lang w:val="es-419" w:eastAsia="es-CO"/>
+          <w:rStyle w:val="Extranjerismo"/>
         </w:rPr>
         <w:t>d</w:t>
       </w:r>
       <w:r>
         <w:rPr>
-          <w:lang w:val="es-419" w:eastAsia="es-CO"/>
-        </w:rPr>
-        <w:t xml:space="preserve">ata, </w:t>
+          <w:rStyle w:val="Extranjerismo"/>
+        </w:rPr>
+        <w:t>ata</w:t>
+      </w:r>
+      <w:r>
+        <w:rPr>
+          <w:lang w:val="es-419" w:eastAsia="es-CO"/>
+        </w:rPr>
+        <w:t xml:space="preserve">, </w:t>
       </w:r>
       <w:r>
         <w:rPr>
@@ -8189,21 +8405,7 @@
         <w:rPr>
           <w:lang w:val="es-419" w:eastAsia="es-CO"/>
         </w:rPr>
-        <w:t xml:space="preserve"> Las organizaciones deben implementar medidas técnicas y administrativas, como cifrado, control de accesos y </w:t>
-      </w:r>
-      <w:proofErr w:type="spellStart"/>
-      <w:r>
-        <w:rPr>
-          <w:lang w:val="es-419" w:eastAsia="es-CO"/>
-        </w:rPr>
-        <w:t>anonimización</w:t>
-      </w:r>
-      <w:proofErr w:type="spellEnd"/>
-      <w:r>
-        <w:rPr>
-          <w:lang w:val="es-419" w:eastAsia="es-CO"/>
-        </w:rPr>
-        <w:t>, para prevenir adulteración, pérdida, filtración o acceso no autorizado a la información.</w:t>
+        <w:t xml:space="preserve"> Las organizaciones deben implementar medidas técnicas y administrativas, como cifrado, control de accesos y anonimización, para prevenir adulteración, pérdida, filtración o acceso no autorizado a la información.</w:t>
       </w:r>
     </w:p>
     <w:p>
@@ -8365,6 +8567,7 @@
       <w:proofErr w:type="spellStart"/>
       <w:r>
         <w:rPr>
+          <w:rStyle w:val="Extranjerismo"/>
           <w:lang w:val="es-419" w:eastAsia="es-CO"/>
         </w:rPr>
         <w:t>Prompts</w:t>
@@ -8505,7 +8708,20 @@
         <w:rPr>
           <w:lang w:val="es-419" w:eastAsia="es-CO"/>
         </w:rPr>
-        <w:t xml:space="preserve"> influye directamente en la precisión, coherencia y utilidad del output producido por el modelo, especialmente en contextos técnicos, académicos y empresariales donde la reducción del margen de error resulta crítica.</w:t>
+        <w:t xml:space="preserve"> influye directamente en la precisión, coherencia y utilidad del </w:t>
+      </w:r>
+      <w:r>
+        <w:rPr>
+          <w:rStyle w:val="Extranjerismo"/>
+          <w:lang w:val="es-419" w:eastAsia="es-CO"/>
+        </w:rPr>
+        <w:t>output</w:t>
+      </w:r>
+      <w:r>
+        <w:rPr>
+          <w:lang w:val="es-419" w:eastAsia="es-CO"/>
+        </w:rPr>
+        <w:t xml:space="preserve"> producido por el modelo, especialmente en contextos técnicos, académicos y empresariales donde la reducción del margen de error resulta crítica.</w:t>
       </w:r>
     </w:p>
     <w:p>
@@ -8690,10 +8906,10 @@
           <w:lang w:val="es-ES" w:eastAsia="es-CO"/>
         </w:rPr>
         <w:drawing>
-          <wp:inline distT="0" distB="0" distL="0" distR="0" wp14:anchorId="1781DA5E" wp14:editId="2658CC91">
-            <wp:extent cx="5401077" cy="4400550"/>
-            <wp:effectExtent l="0" t="0" r="9525" b="0"/>
-            <wp:docPr id="11" name="Gráfico 11" descr="Diagrama sobre la anatomía de un prompt que incluye componentes como instrucción, contexto, datos, formato y audiencia. "/>
+          <wp:inline distT="0" distB="0" distL="0" distR="0" wp14:anchorId="3BF38A3C" wp14:editId="0011C7AC">
+            <wp:extent cx="5214620" cy="4248633"/>
+            <wp:effectExtent l="0" t="0" r="5080" b="0"/>
+            <wp:docPr id="938180151" name="Imagen 3" descr="Diagrama sobre la anatomía de un prompt que incluye componentes como instrucción, contexto, datos, formato y audiencia. "/>
             <wp:cNvGraphicFramePr>
               <a:graphicFrameLocks xmlns:a="http://schemas.openxmlformats.org/drawingml/2006/main" noChangeAspect="1"/>
             </wp:cNvGraphicFramePr>
@@ -8701,7 +8917,7 @@
               <a:graphicData uri="http://schemas.openxmlformats.org/drawingml/2006/picture">
                 <pic:pic xmlns:pic="http://schemas.openxmlformats.org/drawingml/2006/picture">
                   <pic:nvPicPr>
-                    <pic:cNvPr id="11" name="Gráfico 11" descr="Diagrama sobre la anatomía de un prompt que incluye componentes como instrucción, contexto, datos, formato y audiencia. "/>
+                    <pic:cNvPr id="938180151" name="Imagen 3" descr="Diagrama sobre la anatomía de un prompt que incluye componentes como instrucción, contexto, datos, formato y audiencia. "/>
                     <pic:cNvPicPr/>
                   </pic:nvPicPr>
                   <pic:blipFill>
@@ -8709,9 +8925,6 @@
                       <a:extLst>
                         <a:ext uri="{28A0092B-C50C-407E-A947-70E740481C1C}">
                           <a14:useLocalDpi xmlns:a14="http://schemas.microsoft.com/office/drawing/2010/main" val="0"/>
-                        </a:ext>
-                        <a:ext uri="{96DAC541-7B7A-43D3-8B79-37D633B846F1}">
-                          <asvg:svgBlip xmlns:asvg="http://schemas.microsoft.com/office/drawing/2016/SVG/main" r:embed="rId18"/>
                         </a:ext>
                       </a:extLst>
                     </a:blip>
@@ -8722,7 +8935,7 @@
                   <pic:spPr>
                     <a:xfrm>
                       <a:off x="0" y="0"/>
-                      <a:ext cx="5403953" cy="4402893"/>
+                      <a:ext cx="5222742" cy="4255251"/>
                     </a:xfrm>
                     <a:prstGeom prst="rect">
                       <a:avLst/>
@@ -8791,20 +9004,26 @@
           <w:rStyle w:val="Ttulo5Car"/>
           <w:lang w:val="es-ES"/>
         </w:rPr>
+        <w:t>Contexto</w:t>
+      </w:r>
+      <w:r>
+        <w:rPr>
+          <w:rStyle w:val="Ttulo5Car"/>
+        </w:rPr>
+        <w:t>.</w:t>
+      </w:r>
+      <w:r>
+        <w:rPr>
+          <w:lang w:val="es-ES" w:eastAsia="es-CO"/>
+        </w:rPr>
+        <w:t xml:space="preserve"> Proporciona antecedentes, entorno y condiciones relacionadas con la tarea. Incluir contexto permite que la predicción probabilística del modelo </w:t>
+      </w:r>
+      <w:r>
+        <w:rPr>
+          <w:lang w:val="es-ES" w:eastAsia="es-CO"/>
+        </w:rPr>
         <w:lastRenderedPageBreak/>
-        <w:t>Contexto</w:t>
-      </w:r>
-      <w:r>
-        <w:rPr>
-          <w:rStyle w:val="Ttulo5Car"/>
-        </w:rPr>
-        <w:t>.</w:t>
-      </w:r>
-      <w:r>
-        <w:rPr>
-          <w:lang w:val="es-ES" w:eastAsia="es-CO"/>
-        </w:rPr>
-        <w:t xml:space="preserve"> Proporciona antecedentes, entorno y condiciones relacionadas con la tarea. Incluir contexto permite que la predicción probabilística del modelo sea más específica y menos genérica. En esta sección también se asignan roles o perfiles, como “Actúe como un analista de datos sénior”, lo cual condiciona el nivel técnico y el vocabulario utilizado por el sistema.</w:t>
+        <w:t>sea más específica y menos genérica. En esta sección también se asignan roles o perfiles, como “Actúe como un analista de datos sénior”, lo cual condiciona el nivel técnico y el vocabulario utilizado por el sistema.</w:t>
       </w:r>
     </w:p>
     <w:p>
@@ -8962,48 +9181,48 @@
           <w:rStyle w:val="Ttulo3Car"/>
           <w:lang w:val="es-ES"/>
         </w:rPr>
+        <w:t>Delimitadores</w:t>
+      </w:r>
+      <w:r>
+        <w:rPr>
+          <w:rStyle w:val="Ttulo3Car"/>
+        </w:rPr>
+        <w:t>.</w:t>
+      </w:r>
+      <w:r>
+        <w:rPr>
+          <w:lang w:val="es-ES" w:eastAsia="es-CO"/>
+        </w:rPr>
+        <w:t xml:space="preserve"> Los delimitadores corresponden a secuencias de caracteres especiales o signos de puntuación utilizados para separar claramente las distintas secciones de un </w:t>
+      </w:r>
+      <w:proofErr w:type="spellStart"/>
+      <w:r>
+        <w:rPr>
+          <w:rStyle w:val="Extranjerismo"/>
+          <w:lang w:val="es-ES" w:eastAsia="es-CO"/>
+        </w:rPr>
+        <w:t>prompt</w:t>
+      </w:r>
+      <w:proofErr w:type="spellEnd"/>
+      <w:r>
+        <w:rPr>
+          <w:lang w:val="es-ES" w:eastAsia="es-CO"/>
+        </w:rPr>
+        <w:t>, como:</w:t>
+      </w:r>
+    </w:p>
+    <w:p>
+      <w:pPr>
+        <w:pStyle w:val="Tabla"/>
+        <w:rPr>
+          <w:lang w:val="es-ES" w:eastAsia="es-CO"/>
+        </w:rPr>
+      </w:pPr>
+      <w:r>
+        <w:rPr>
+          <w:lang w:val="es-ES" w:eastAsia="es-CO"/>
+        </w:rPr>
         <w:lastRenderedPageBreak/>
-        <w:t>Delimitadores</w:t>
-      </w:r>
-      <w:r>
-        <w:rPr>
-          <w:rStyle w:val="Ttulo3Car"/>
-        </w:rPr>
-        <w:t>.</w:t>
-      </w:r>
-      <w:r>
-        <w:rPr>
-          <w:lang w:val="es-ES" w:eastAsia="es-CO"/>
-        </w:rPr>
-        <w:t xml:space="preserve"> Los delimitadores corresponden a secuencias de caracteres especiales o signos de puntuación utilizados para separar claramente las distintas secciones de un </w:t>
-      </w:r>
-      <w:proofErr w:type="spellStart"/>
-      <w:r>
-        <w:rPr>
-          <w:rStyle w:val="Extranjerismo"/>
-          <w:lang w:val="es-ES" w:eastAsia="es-CO"/>
-        </w:rPr>
-        <w:t>prompt</w:t>
-      </w:r>
-      <w:proofErr w:type="spellEnd"/>
-      <w:r>
-        <w:rPr>
-          <w:lang w:val="es-ES" w:eastAsia="es-CO"/>
-        </w:rPr>
-        <w:t>, como:</w:t>
-      </w:r>
-    </w:p>
-    <w:p>
-      <w:pPr>
-        <w:pStyle w:val="Tabla"/>
-        <w:rPr>
-          <w:lang w:val="es-ES" w:eastAsia="es-CO"/>
-        </w:rPr>
-      </w:pPr>
-      <w:r>
-        <w:rPr>
-          <w:lang w:val="es-ES" w:eastAsia="es-CO"/>
-        </w:rPr>
         <w:t xml:space="preserve">Símbolos utilizados para estructurar </w:t>
       </w:r>
       <w:r>
@@ -9036,8 +9255,14 @@
           <w:p>
             <w:pPr>
               <w:pStyle w:val="Tablas"/>
+              <w:rPr>
+                <w:szCs w:val="21"/>
+              </w:rPr>
             </w:pPr>
             <w:r>
+              <w:rPr>
+                <w:szCs w:val="21"/>
+              </w:rPr>
               <w:t>Símbolo</w:t>
             </w:r>
           </w:p>
@@ -9050,8 +9275,14 @@
           <w:p>
             <w:pPr>
               <w:pStyle w:val="Tablas"/>
+              <w:rPr>
+                <w:szCs w:val="21"/>
+              </w:rPr>
             </w:pPr>
             <w:r>
+              <w:rPr>
+                <w:szCs w:val="21"/>
+              </w:rPr>
               <w:t>Significado</w:t>
             </w:r>
           </w:p>
@@ -9069,8 +9300,14 @@
           <w:p>
             <w:pPr>
               <w:pStyle w:val="Tablas"/>
+              <w:rPr>
+                <w:szCs w:val="21"/>
+              </w:rPr>
             </w:pPr>
             <w:r>
+              <w:rPr>
+                <w:szCs w:val="21"/>
+              </w:rPr>
               <w:t>###</w:t>
             </w:r>
           </w:p>
@@ -9083,17 +9320,30 @@
           <w:p>
             <w:pPr>
               <w:pStyle w:val="Tablas"/>
+              <w:rPr>
+                <w:szCs w:val="21"/>
+              </w:rPr>
             </w:pPr>
             <w:r>
+              <w:rPr>
+                <w:szCs w:val="21"/>
+              </w:rPr>
               <w:t>Se usa para crear encabezados o separar secciones dentro del </w:t>
             </w:r>
+            <w:proofErr w:type="spellStart"/>
             <w:r>
               <w:rPr>
                 <w:rStyle w:val="Extranjerismo"/>
+                <w:szCs w:val="21"/>
+                <w:lang w:val="es-ES"/>
               </w:rPr>
               <w:t>prompt</w:t>
             </w:r>
-            <w:r>
+            <w:proofErr w:type="spellEnd"/>
+            <w:r>
+              <w:rPr>
+                <w:szCs w:val="21"/>
+              </w:rPr>
               <w:t>.</w:t>
             </w:r>
           </w:p>
@@ -9108,8 +9358,14 @@
           <w:p>
             <w:pPr>
               <w:pStyle w:val="Tablas"/>
+              <w:rPr>
+                <w:szCs w:val="21"/>
+              </w:rPr>
             </w:pPr>
             <w:r>
+              <w:rPr>
+                <w:szCs w:val="21"/>
+              </w:rPr>
               <w:t>"""</w:t>
             </w:r>
           </w:p>
@@ -9122,8 +9378,14 @@
           <w:p>
             <w:pPr>
               <w:pStyle w:val="Tablas"/>
+              <w:rPr>
+                <w:szCs w:val="21"/>
+              </w:rPr>
             </w:pPr>
             <w:r>
+              <w:rPr>
+                <w:szCs w:val="21"/>
+              </w:rPr>
               <w:t>Delimita bloques de texto, documentos extensos o contenido que debe analizarse como una unidad.</w:t>
             </w:r>
           </w:p>
@@ -9141,8 +9403,14 @@
           <w:p>
             <w:pPr>
               <w:pStyle w:val="Tablas"/>
+              <w:rPr>
+                <w:szCs w:val="21"/>
+              </w:rPr>
             </w:pPr>
             <w:r>
+              <w:rPr>
+                <w:szCs w:val="21"/>
+              </w:rPr>
               <w:t>---</w:t>
             </w:r>
           </w:p>
@@ -9155,8 +9423,14 @@
           <w:p>
             <w:pPr>
               <w:pStyle w:val="Tablas"/>
+              <w:rPr>
+                <w:szCs w:val="21"/>
+              </w:rPr>
             </w:pPr>
             <w:r>
+              <w:rPr>
+                <w:szCs w:val="21"/>
+              </w:rPr>
               <w:t>Marca divisiones temáticas o separa bloques de información.</w:t>
             </w:r>
           </w:p>
@@ -9171,8 +9445,14 @@
           <w:p>
             <w:pPr>
               <w:pStyle w:val="Tablas"/>
+              <w:rPr>
+                <w:szCs w:val="21"/>
+              </w:rPr>
             </w:pPr>
             <w:r>
+              <w:rPr>
+                <w:szCs w:val="21"/>
+              </w:rPr>
               <w:t>&lt; &gt;</w:t>
             </w:r>
           </w:p>
@@ -9185,8 +9465,14 @@
           <w:p>
             <w:pPr>
               <w:pStyle w:val="Tablas"/>
+              <w:rPr>
+                <w:szCs w:val="21"/>
+              </w:rPr>
             </w:pPr>
             <w:r>
+              <w:rPr>
+                <w:szCs w:val="21"/>
+              </w:rPr>
               <w:t>Funciona como marcador estructurado, similar a XML o HTML, para delimitar etiquetas o categorías de contenido.</w:t>
             </w:r>
           </w:p>
@@ -9203,21 +9489,19 @@
         <w:rPr>
           <w:lang w:val="es-ES" w:eastAsia="es-CO"/>
         </w:rPr>
-        <w:t xml:space="preserve">Su función principal consiste en establecer fronteras precisas entre instrucciones, contexto, datos de entrada y ejemplos, permitiendo que el modelo de lenguaje de gran escala (Large </w:t>
-      </w:r>
-      <w:proofErr w:type="spellStart"/>
-      <w:r>
-        <w:rPr>
-          <w:lang w:val="es-ES" w:eastAsia="es-CO"/>
-        </w:rPr>
-        <w:t>Language</w:t>
-      </w:r>
-      <w:proofErr w:type="spellEnd"/>
-      <w:r>
-        <w:rPr>
-          <w:lang w:val="es-ES" w:eastAsia="es-CO"/>
-        </w:rPr>
-        <w:t xml:space="preserve"> Model [LLM]) procese cada bloque de información de manera organizada y eficiente. Dentro de la ingeniería de </w:t>
+        <w:t>Su función principal consiste en establecer fronteras precisas entre instrucciones, contexto, datos de entrada y ejemplos, permitiendo que el modelo de lenguaje de gran escala (</w:t>
+      </w:r>
+      <w:r>
+        <w:rPr>
+          <w:rStyle w:val="Extranjerismo"/>
+        </w:rPr>
+        <w:t>Large Language Model</w:t>
+      </w:r>
+      <w:r>
+        <w:rPr>
+          <w:lang w:val="es-ES" w:eastAsia="es-CO"/>
+        </w:rPr>
+        <w:t xml:space="preserve"> [LLM]) procese cada bloque de información de manera organizada y eficiente. Dentro de la ingeniería de </w:t>
       </w:r>
       <w:proofErr w:type="spellStart"/>
       <w:r>
@@ -9311,7 +9595,55 @@
         <w:rPr>
           <w:lang w:val="es-ES" w:eastAsia="es-CO"/>
         </w:rPr>
-        <w:t xml:space="preserve"> Facilitan la estructuración de información compleja mediante encabezados como ###Instrucción### o ###Ejemplo###, mejorando la lógica interna del </w:t>
+        <w:t xml:space="preserve"> Facilitan la estructuración de información compleja mediante encabezados como ###</w:t>
+      </w:r>
+      <w:r>
+        <w:rPr>
+          <w:lang w:val="es-ES" w:eastAsia="es-CO"/>
+        </w:rPr>
+        <w:t xml:space="preserve"> </w:t>
+      </w:r>
+      <w:r>
+        <w:rPr>
+          <w:lang w:val="es-ES" w:eastAsia="es-CO"/>
+        </w:rPr>
+        <w:t>Instrucción</w:t>
+      </w:r>
+      <w:r>
+        <w:rPr>
+          <w:lang w:val="es-ES" w:eastAsia="es-CO"/>
+        </w:rPr>
+        <w:t xml:space="preserve"> </w:t>
+      </w:r>
+      <w:r>
+        <w:rPr>
+          <w:lang w:val="es-ES" w:eastAsia="es-CO"/>
+        </w:rPr>
+        <w:t>### o ###</w:t>
+      </w:r>
+      <w:r>
+        <w:rPr>
+          <w:lang w:val="es-ES" w:eastAsia="es-CO"/>
+        </w:rPr>
+        <w:t xml:space="preserve"> </w:t>
+      </w:r>
+      <w:r>
+        <w:rPr>
+          <w:lang w:val="es-ES" w:eastAsia="es-CO"/>
+        </w:rPr>
+        <w:t>Ejemplo</w:t>
+      </w:r>
+      <w:r>
+        <w:rPr>
+          <w:lang w:val="es-ES" w:eastAsia="es-CO"/>
+        </w:rPr>
+        <w:t xml:space="preserve"> </w:t>
+      </w:r>
+      <w:r>
+        <w:rPr>
+          <w:lang w:val="es-ES" w:eastAsia="es-CO"/>
+        </w:rPr>
+        <w:t xml:space="preserve">###, mejorando la lógica interna del </w:t>
       </w:r>
       <w:proofErr w:type="spellStart"/>
       <w:r>
@@ -9358,14 +9690,7 @@
         <w:rPr>
           <w:lang w:val="es-ES" w:eastAsia="es-CO"/>
         </w:rPr>
-        <w:t xml:space="preserve"> El uso de delimitadores para aislar preguntas, contexto y datos constituye uno de los principios identificados para </w:t>
-      </w:r>
-      <w:r>
-        <w:rPr>
-          <w:lang w:val="es-ES" w:eastAsia="es-CO"/>
-        </w:rPr>
-        <w:lastRenderedPageBreak/>
-        <w:t>mejorar la calidad y relevancia de las respuestas generadas por IA (academia-ia.com, 2024).</w:t>
+        <w:t xml:space="preserve"> El uso de delimitadores para aislar preguntas, contexto y datos constituye uno de los principios identificados para mejorar la calidad y relevancia de las respuestas generadas por IA (academia-ia.com, 2024).</w:t>
       </w:r>
     </w:p>
     <w:p>
@@ -9410,6 +9735,7 @@
         <w:rPr>
           <w:lang w:val="es-ES" w:eastAsia="es-CO"/>
         </w:rPr>
+        <w:lastRenderedPageBreak/>
         <w:t xml:space="preserve">En términos técnicos, los delimitadores funcionan como un mecanismo de programación en lenguaje natural, permitiendo organizar la arquitectura del </w:t>
       </w:r>
       <w:proofErr w:type="spellStart"/>
@@ -9425,7 +9751,19 @@
         <w:rPr>
           <w:lang w:val="es-ES" w:eastAsia="es-CO"/>
         </w:rPr>
-        <w:t xml:space="preserve"> de forma más coherente, precisa y eficiente. Su correcta implementación reduce errores interpretativos, mejora la calidad del output y fortalece la capacidad del modelo para ejecutar tareas complejas dentro de contextos profesionales y productivos.</w:t>
+        <w:t xml:space="preserve"> de forma más coherente, precisa y eficiente. Su correcta implementación reduce errores interpretativos, mejora la calidad del </w:t>
+      </w:r>
+      <w:r>
+        <w:rPr>
+          <w:rStyle w:val="Extranjerismo"/>
+        </w:rPr>
+        <w:t>output</w:t>
+      </w:r>
+      <w:r>
+        <w:rPr>
+          <w:lang w:val="es-ES" w:eastAsia="es-CO"/>
+        </w:rPr>
+        <w:t xml:space="preserve"> y fortalece la capacidad del modelo para ejecutar tareas complejas dentro de contextos profesionales y productivos.</w:t>
       </w:r>
     </w:p>
     <w:p>
@@ -9479,7 +9817,6 @@
         </w:rPr>
         <w:t xml:space="preserve"> </w:t>
       </w:r>
-      <w:proofErr w:type="gramStart"/>
       <w:r>
         <w:rPr>
           <w:lang w:val="es-ES" w:eastAsia="es-CO"/>
@@ -9490,15 +9827,8 @@
         <w:rPr>
           <w:lang w:val="es-ES" w:eastAsia="es-CO"/>
         </w:rPr>
-        <w:t xml:space="preserve"> </w:t>
-      </w:r>
-      <w:r>
-        <w:rPr>
-          <w:lang w:val="es-ES" w:eastAsia="es-CO"/>
-        </w:rPr>
         <w:t>continuación</w:t>
       </w:r>
-      <w:proofErr w:type="gramEnd"/>
       <w:r>
         <w:rPr>
           <w:lang w:val="es-ES" w:eastAsia="es-CO"/>
@@ -9525,10 +9855,9 @@
       <w:pPr>
         <w:pStyle w:val="Prrafodelista"/>
         <w:numPr>
-          <w:ilvl w:val="0"/>
+          <w:ilvl w:val="1"/>
           <w:numId w:val="30"/>
         </w:numPr>
-        <w:ind w:left="993"/>
         <w:rPr>
           <w:lang w:val="es-ES" w:eastAsia="es-CO"/>
         </w:rPr>
@@ -9550,17 +9879,40 @@
         <w:rPr>
           <w:lang w:val="es-ES" w:eastAsia="es-CO"/>
         </w:rPr>
-        <w:t xml:space="preserve"> ###Contexto### Actúe como un consultor sénior en gestión de calidad y procesos organizacionales, con amplia experiencia en implementación de normas ISO.</w:t>
+        <w:t xml:space="preserve"> ###</w:t>
+      </w:r>
+      <w:r>
+        <w:rPr>
+          <w:lang w:val="es-ES" w:eastAsia="es-CO"/>
+        </w:rPr>
+        <w:t xml:space="preserve"> </w:t>
+      </w:r>
+      <w:r>
+        <w:rPr>
+          <w:lang w:val="es-ES" w:eastAsia="es-CO"/>
+        </w:rPr>
+        <w:t>Contexto</w:t>
+      </w:r>
+      <w:r>
+        <w:rPr>
+          <w:lang w:val="es-ES" w:eastAsia="es-CO"/>
+        </w:rPr>
+        <w:t xml:space="preserve"> </w:t>
+      </w:r>
+      <w:r>
+        <w:rPr>
+          <w:lang w:val="es-ES" w:eastAsia="es-CO"/>
+        </w:rPr>
+        <w:t>### Actúe como un consultor sénior en gestión de calidad y procesos organizacionales, con amplia experiencia en implementación de normas ISO.</w:t>
       </w:r>
     </w:p>
     <w:p>
       <w:pPr>
         <w:pStyle w:val="Prrafodelista"/>
         <w:numPr>
-          <w:ilvl w:val="0"/>
+          <w:ilvl w:val="1"/>
           <w:numId w:val="30"/>
         </w:numPr>
-        <w:ind w:left="993"/>
         <w:rPr>
           <w:lang w:val="es-ES" w:eastAsia="es-CO"/>
         </w:rPr>
@@ -9582,17 +9934,40 @@
         <w:rPr>
           <w:lang w:val="es-ES" w:eastAsia="es-CO"/>
         </w:rPr>
-        <w:t xml:space="preserve"> ###Instrucción### Analice el siguiente informe de hallazgos de una auditoría interna e identifique los tres riesgos de mayor impacto para la continuidad del negocio. Posteriormente, proponga medidas correctivas inmediatas para cada caso.</w:t>
+        <w:t xml:space="preserve"> ###</w:t>
+      </w:r>
+      <w:r>
+        <w:rPr>
+          <w:lang w:val="es-ES" w:eastAsia="es-CO"/>
+        </w:rPr>
+        <w:t xml:space="preserve"> </w:t>
+      </w:r>
+      <w:r>
+        <w:rPr>
+          <w:lang w:val="es-ES" w:eastAsia="es-CO"/>
+        </w:rPr>
+        <w:t>Instrucción</w:t>
+      </w:r>
+      <w:r>
+        <w:rPr>
+          <w:lang w:val="es-ES" w:eastAsia="es-CO"/>
+        </w:rPr>
+        <w:t xml:space="preserve"> </w:t>
+      </w:r>
+      <w:r>
+        <w:rPr>
+          <w:lang w:val="es-ES" w:eastAsia="es-CO"/>
+        </w:rPr>
+        <w:t>### Analice el siguiente informe de hallazgos de una auditoría interna e identifique los tres riesgos de mayor impacto para la continuidad del negocio. Posteriormente, proponga medidas correctivas inmediatas para cada caso.</w:t>
       </w:r>
     </w:p>
     <w:p>
       <w:pPr>
         <w:pStyle w:val="Prrafodelista"/>
         <w:numPr>
-          <w:ilvl w:val="0"/>
+          <w:ilvl w:val="1"/>
           <w:numId w:val="30"/>
         </w:numPr>
-        <w:ind w:left="993"/>
         <w:rPr>
           <w:lang w:val="es-ES" w:eastAsia="es-CO"/>
         </w:rPr>
@@ -9602,30 +9977,59 @@
           <w:rStyle w:val="Ttulo5Car"/>
           <w:lang w:val="es-ES"/>
         </w:rPr>
+        <w:t>Paso 3. Datos de entrada</w:t>
+      </w:r>
+      <w:r>
+        <w:rPr>
+          <w:rStyle w:val="Ttulo5Car"/>
+        </w:rPr>
+        <w:t>.</w:t>
+      </w:r>
+      <w:r>
+        <w:rPr>
+          <w:lang w:val="es-ES" w:eastAsia="es-CO"/>
+        </w:rPr>
+        <w:t xml:space="preserve"> ###</w:t>
+      </w:r>
+      <w:r>
+        <w:rPr>
+          <w:lang w:val="es-ES" w:eastAsia="es-CO"/>
+        </w:rPr>
+        <w:t xml:space="preserve"> </w:t>
+      </w:r>
+      <w:r>
+        <w:rPr>
+          <w:lang w:val="es-ES" w:eastAsia="es-CO"/>
+        </w:rPr>
+        <w:t>Datos de Entrada</w:t>
+      </w:r>
+      <w:r>
+        <w:rPr>
+          <w:lang w:val="es-ES" w:eastAsia="es-CO"/>
+        </w:rPr>
+        <w:t xml:space="preserve"> </w:t>
+      </w:r>
+      <w:r>
+        <w:rPr>
+          <w:lang w:val="es-ES" w:eastAsia="es-CO"/>
+        </w:rPr>
+        <w:t xml:space="preserve">### """ 1. Se detectó una falta de actualización en los respaldos de la base de datos de clientes desde hace 45 días. 2. El 30 % del personal nuevo </w:t>
+      </w:r>
+      <w:r>
+        <w:rPr>
+          <w:lang w:val="es-ES" w:eastAsia="es-CO"/>
+        </w:rPr>
         <w:lastRenderedPageBreak/>
-        <w:t>Paso 3. Datos de entrada</w:t>
-      </w:r>
-      <w:r>
-        <w:rPr>
-          <w:rStyle w:val="Ttulo5Car"/>
-        </w:rPr>
-        <w:t>.</w:t>
-      </w:r>
-      <w:r>
-        <w:rPr>
-          <w:lang w:val="es-ES" w:eastAsia="es-CO"/>
-        </w:rPr>
-        <w:t xml:space="preserve"> ###Datos de Entrada### """ 1. Se detectó una falta de actualización en los respaldos de la base de datos de clientes desde hace 45 días. 2. El 30 % del personal nuevo no ha completado el módulo de capacitación sobre seguridad de la información. 3. El proveedor principal de suministros presenta retrasos logísticos recurrentes en la última milla. """</w:t>
+        <w:t>no ha completado el módulo de capacitación sobre seguridad de la información. 3. El proveedor principal de suministros presenta retrasos logísticos recurrentes en la última milla. """</w:t>
       </w:r>
     </w:p>
     <w:p>
       <w:pPr>
         <w:pStyle w:val="Prrafodelista"/>
         <w:numPr>
-          <w:ilvl w:val="0"/>
+          <w:ilvl w:val="1"/>
           <w:numId w:val="30"/>
         </w:numPr>
-        <w:ind w:left="993"/>
         <w:rPr>
           <w:lang w:val="es-ES" w:eastAsia="es-CO"/>
         </w:rPr>
@@ -9647,17 +10051,40 @@
         <w:rPr>
           <w:lang w:val="es-ES" w:eastAsia="es-CO"/>
         </w:rPr>
-        <w:t xml:space="preserve"> ###Indicadores de Formato### Presente los resultados en un cuadro con tres columnas: “Riesgo identificado”, “Impacto potencial” y “Acción correctiva sugerida”. No exceda las 200 palabras en total.</w:t>
+        <w:t xml:space="preserve"> ###</w:t>
+      </w:r>
+      <w:r>
+        <w:rPr>
+          <w:lang w:val="es-ES" w:eastAsia="es-CO"/>
+        </w:rPr>
+        <w:t xml:space="preserve"> </w:t>
+      </w:r>
+      <w:r>
+        <w:rPr>
+          <w:lang w:val="es-ES" w:eastAsia="es-CO"/>
+        </w:rPr>
+        <w:t>Indicadores de Formato</w:t>
+      </w:r>
+      <w:r>
+        <w:rPr>
+          <w:lang w:val="es-ES" w:eastAsia="es-CO"/>
+        </w:rPr>
+        <w:t xml:space="preserve"> </w:t>
+      </w:r>
+      <w:r>
+        <w:rPr>
+          <w:lang w:val="es-ES" w:eastAsia="es-CO"/>
+        </w:rPr>
+        <w:t>### Presente los resultados en un cuadro con tres columnas: “Riesgo identificado”, “Impacto potencial” y “Acción correctiva sugerida”. No exceda las 200 palabras en total.</w:t>
       </w:r>
     </w:p>
     <w:p>
       <w:pPr>
         <w:pStyle w:val="Prrafodelista"/>
         <w:numPr>
-          <w:ilvl w:val="0"/>
+          <w:ilvl w:val="1"/>
           <w:numId w:val="30"/>
         </w:numPr>
-        <w:ind w:left="993"/>
         <w:rPr>
           <w:lang w:val="es-ES" w:eastAsia="es-CO"/>
         </w:rPr>
@@ -9679,7 +10106,31 @@
         <w:rPr>
           <w:lang w:val="es-ES" w:eastAsia="es-CO"/>
         </w:rPr>
-        <w:t xml:space="preserve"> ###Tono y Audiencia### Utilice un tono profesional, ejecutivo y directo. El informe está dirigido a la junta directiva de la organización, por lo que debe enfatizar la mitigación de riesgos operativos.</w:t>
+        <w:t xml:space="preserve"> ###</w:t>
+      </w:r>
+      <w:r>
+        <w:rPr>
+          <w:lang w:val="es-ES" w:eastAsia="es-CO"/>
+        </w:rPr>
+        <w:t xml:space="preserve"> </w:t>
+      </w:r>
+      <w:r>
+        <w:rPr>
+          <w:lang w:val="es-ES" w:eastAsia="es-CO"/>
+        </w:rPr>
+        <w:t>Tono y Audiencia</w:t>
+      </w:r>
+      <w:r>
+        <w:rPr>
+          <w:lang w:val="es-ES" w:eastAsia="es-CO"/>
+        </w:rPr>
+        <w:t xml:space="preserve"> </w:t>
+      </w:r>
+      <w:r>
+        <w:rPr>
+          <w:lang w:val="es-ES" w:eastAsia="es-CO"/>
+        </w:rPr>
+        <w:t>### Utilice un tono profesional, ejecutivo y directo. El informe está dirigido a la junta directiva de la organización, por lo que debe enfatizar la mitigación de riesgos operativos.</w:t>
       </w:r>
     </w:p>
     <w:p>
@@ -9778,10 +10229,9 @@
       <w:pPr>
         <w:pStyle w:val="Prrafodelista"/>
         <w:numPr>
-          <w:ilvl w:val="0"/>
+          <w:ilvl w:val="1"/>
           <w:numId w:val="29"/>
         </w:numPr>
-        <w:ind w:left="993"/>
         <w:rPr>
           <w:lang w:val="es-ES" w:eastAsia="es-CO"/>
         </w:rPr>
@@ -9847,10 +10297,9 @@
       <w:pPr>
         <w:pStyle w:val="Prrafodelista"/>
         <w:numPr>
-          <w:ilvl w:val="0"/>
+          <w:ilvl w:val="1"/>
           <w:numId w:val="29"/>
         </w:numPr>
-        <w:ind w:left="993"/>
         <w:rPr>
           <w:lang w:val="es-ES" w:eastAsia="es-CO"/>
         </w:rPr>
@@ -9906,10 +10355,9 @@
       <w:pPr>
         <w:pStyle w:val="Prrafodelista"/>
         <w:numPr>
-          <w:ilvl w:val="0"/>
+          <w:ilvl w:val="1"/>
           <w:numId w:val="29"/>
         </w:numPr>
-        <w:ind w:left="993"/>
         <w:rPr>
           <w:lang w:val="es-ES" w:eastAsia="es-CO"/>
         </w:rPr>
@@ -9965,20 +10413,46 @@
         <w:rPr>
           <w:lang w:val="es-ES" w:eastAsia="es-CO"/>
         </w:rPr>
-        <w:t xml:space="preserve"> Suministra un pequeño conjunto de ejemplos etiquetados, usualmente entre 2 y 5. Es una técnica robusta para tareas que requieren precisión técnica y consistencia, ya que permite al LLM identificar reglas complejas y adaptarse a dominios especializados, como el jurídico o el desarrollo de software, sin reentrenamiento masivo (Méndez Solano, Durán Campos y Quirós Artiñano, 2024).</w:t>
-      </w:r>
-    </w:p>
-    <w:p>
-      <w:pPr>
-        <w:rPr>
-          <w:lang w:val="es-ES" w:eastAsia="es-CO"/>
-        </w:rPr>
-      </w:pPr>
-      <w:r>
-        <w:rPr>
-          <w:lang w:val="es-ES" w:eastAsia="es-CO"/>
-        </w:rPr>
-        <w:t>Estas estrategias permiten ajustar el comportamiento del modelo mediante ejemplos progresivos, lo que mejora la consistencia del output en tareas repetitivas o altamente especializadas.</w:t>
+        <w:t xml:space="preserve"> Suministra un pequeño conjunto de ejemplos etiquetados, usualmente entre 2 y 5. Es una técnica robusta para tareas que requieren precisión técnica y consistencia, ya que permite al LLM identificar reglas complejas y adaptarse a dominios especializados, como el jurídico o el desarrollo de </w:t>
+      </w:r>
+      <w:r>
+        <w:rPr>
+          <w:rStyle w:val="Extranjerismo"/>
+          <w:lang w:val="es-ES" w:eastAsia="es-CO"/>
+        </w:rPr>
+        <w:t>software</w:t>
+      </w:r>
+      <w:r>
+        <w:rPr>
+          <w:lang w:val="es-ES" w:eastAsia="es-CO"/>
+        </w:rPr>
+        <w:t>, sin reentrenamiento masivo (Méndez Solano, Durán Campos y Quirós Artiñano, 2024).</w:t>
+      </w:r>
+    </w:p>
+    <w:p>
+      <w:pPr>
+        <w:rPr>
+          <w:lang w:val="es-ES" w:eastAsia="es-CO"/>
+        </w:rPr>
+      </w:pPr>
+      <w:r>
+        <w:rPr>
+          <w:lang w:val="es-ES" w:eastAsia="es-CO"/>
+        </w:rPr>
+        <w:t xml:space="preserve">Estas estrategias permiten ajustar el comportamiento del modelo mediante ejemplos progresivos, lo que mejora la consistencia del </w:t>
+      </w:r>
+      <w:r>
+        <w:rPr>
+          <w:rStyle w:val="Extranjerismo"/>
+          <w:lang w:val="es-ES" w:eastAsia="es-CO"/>
+        </w:rPr>
+        <w:t>output</w:t>
+      </w:r>
+      <w:r>
+        <w:rPr>
+          <w:lang w:val="es-ES" w:eastAsia="es-CO"/>
+        </w:rPr>
+        <w:t xml:space="preserve"> en tareas repetitivas o altamente especializadas.</w:t>
       </w:r>
     </w:p>
     <w:p>
@@ -10017,10 +10491,9 @@
       <w:pPr>
         <w:pStyle w:val="Prrafodelista"/>
         <w:numPr>
-          <w:ilvl w:val="0"/>
+          <w:ilvl w:val="1"/>
           <w:numId w:val="31"/>
         </w:numPr>
-        <w:ind w:left="993"/>
         <w:rPr>
           <w:lang w:val="es-ES" w:eastAsia="es-CO"/>
         </w:rPr>
@@ -10032,6 +10505,7 @@
           <w:bCs/>
           <w:lang w:eastAsia="es-CO"/>
         </w:rPr>
+        <w:lastRenderedPageBreak/>
         <w:t>Chain-of-Thought</w:t>
       </w:r>
       <w:r>
@@ -10099,24 +10573,16 @@
         <w:rPr>
           <w:lang w:val="es-ES" w:eastAsia="es-CO"/>
         </w:rPr>
-        <w:t xml:space="preserve">Instruye al modelo para resolver un problema mediante pasos intermedios. Al descomponer una tarea </w:t>
-      </w:r>
-      <w:r>
-        <w:rPr>
-          <w:lang w:val="es-ES" w:eastAsia="es-CO"/>
-        </w:rPr>
-        <w:lastRenderedPageBreak/>
-        <w:t>compleja en una secuencia lógica, mejora la precisión en razonamientos aritméticos, deductivos o procedimentales.</w:t>
+        <w:t>Instruye al modelo para resolver un problema mediante pasos intermedios. Al descomponer una tarea compleja en una secuencia lógica, mejora la precisión en razonamientos aritméticos, deductivos o procedimentales.</w:t>
       </w:r>
     </w:p>
     <w:p>
       <w:pPr>
         <w:pStyle w:val="Prrafodelista"/>
         <w:numPr>
-          <w:ilvl w:val="0"/>
+          <w:ilvl w:val="1"/>
           <w:numId w:val="31"/>
         </w:numPr>
-        <w:ind w:left="993"/>
         <w:rPr>
           <w:lang w:val="es-ES" w:eastAsia="es-CO"/>
         </w:rPr>
@@ -10208,10 +10674,9 @@
       <w:pPr>
         <w:pStyle w:val="Prrafodelista"/>
         <w:numPr>
-          <w:ilvl w:val="0"/>
+          <w:ilvl w:val="1"/>
           <w:numId w:val="31"/>
         </w:numPr>
-        <w:ind w:left="993"/>
         <w:rPr>
           <w:lang w:val="es-ES" w:eastAsia="es-CO"/>
         </w:rPr>
@@ -10267,6 +10732,7 @@
       <w:proofErr w:type="spellStart"/>
       <w:r>
         <w:rPr>
+          <w:rStyle w:val="Extranjerismo"/>
           <w:lang w:val="es-ES" w:eastAsia="es-CO"/>
         </w:rPr>
         <w:t>prompt</w:t>
@@ -10283,24 +10749,21 @@
       <w:pPr>
         <w:pStyle w:val="Prrafodelista"/>
         <w:numPr>
-          <w:ilvl w:val="0"/>
+          <w:ilvl w:val="1"/>
           <w:numId w:val="31"/>
         </w:numPr>
-        <w:ind w:left="993"/>
-        <w:rPr>
-          <w:lang w:val="es-ES" w:eastAsia="es-CO"/>
-        </w:rPr>
-      </w:pPr>
-      <w:proofErr w:type="spellStart"/>
-      <w:r>
-        <w:rPr>
+        <w:rPr>
+          <w:lang w:val="es-ES" w:eastAsia="es-CO"/>
+        </w:rPr>
+      </w:pPr>
+      <w:r>
+        <w:rPr>
+          <w:rStyle w:val="Extranjerismo"/>
           <w:b/>
           <w:bCs/>
-          <w:lang w:val="es-ES" w:eastAsia="es-CO"/>
         </w:rPr>
         <w:t>Skeleton-of-Thought</w:t>
       </w:r>
-      <w:proofErr w:type="spellEnd"/>
       <w:r>
         <w:rPr>
           <w:lang w:val="es-ES" w:eastAsia="es-CO"/>
@@ -10350,12 +10813,24 @@
         <w:rPr>
           <w:lang w:val="es-ES" w:eastAsia="es-CO"/>
         </w:rPr>
-        <w:t xml:space="preserve">Los invitamos a revisar este podcast, el cual sintetiza los principales contenidos desarrollados en el componente formativo. Este audio fue creado con la herramienta de inteligencia artificial </w:t>
+        <w:t>Los invitamos a revisar este p</w:t>
+      </w:r>
+      <w:r>
+        <w:rPr>
+          <w:lang w:val="es-ES" w:eastAsia="es-CO"/>
+        </w:rPr>
+        <w:t>ó</w:t>
+      </w:r>
+      <w:r>
+        <w:rPr>
+          <w:lang w:val="es-ES" w:eastAsia="es-CO"/>
+        </w:rPr>
+        <w:t xml:space="preserve">dcast, el cual sintetiza los principales contenidos desarrollados en el componente formativo. Este audio fue creado con la herramienta de inteligencia artificial </w:t>
       </w:r>
       <w:proofErr w:type="spellStart"/>
       <w:r>
         <w:rPr>
-          <w:lang w:val="es-ES" w:eastAsia="es-CO"/>
+          <w:rStyle w:val="Extranjerismo"/>
         </w:rPr>
         <w:t>NotebookLM</w:t>
       </w:r>
@@ -10366,20 +10841,6 @@
         </w:rPr>
         <w:t>, evidenciando una aplicación práctica del uso de la IA en escenarios educativos y de generación de contenido.</w:t>
       </w:r>
-    </w:p>
-    <w:p>
-      <w:pPr>
-        <w:rPr>
-          <w:lang w:val="es-ES" w:eastAsia="es-CO"/>
-        </w:rPr>
-      </w:pPr>
-    </w:p>
-    <w:p>
-      <w:pPr>
-        <w:rPr>
-          <w:lang w:val="es-ES" w:eastAsia="es-CO"/>
-        </w:rPr>
-      </w:pPr>
     </w:p>
     <w:tbl>
       <w:tblPr>
@@ -10410,7 +10871,14 @@
                 <w:bCs/>
               </w:rPr>
               <w:lastRenderedPageBreak/>
-              <w:t xml:space="preserve">Transcripción del pódcast. </w:t>
+              <w:t>Síntesis</w:t>
+            </w:r>
+            <w:r>
+              <w:rPr>
+                <w:b/>
+                <w:bCs/>
+              </w:rPr>
+              <w:t xml:space="preserve"> del pódcast. </w:t>
             </w:r>
             <w:r>
               <w:rPr>
@@ -10429,12 +10897,36 @@
           </w:tcPr>
           <w:p>
             <w:r>
-              <w:t>El podcast analiza el funcionamiento, los riesgos y el uso responsable de la inteligencia artificial, especialmente de los modelos de lenguaje de gran escala. Para introducir el tema, se menciona el caso Mata contra Avianca, ocurrido en 2023, donde unos abogados presentaron ante un juez federal en Nueva York un documento legal con citas de casos judiciales inexistentes, generadas por una inteligencia artificial. Este ejemplo permite evidenciar uno de los principales peligros de estas herramientas: la capacidad de producir textos muy fluidos, convincentes y aparentemente profesionales, aunque no necesariamente verdaderos.</w:t>
+              <w:t>El p</w:t>
+            </w:r>
+            <w:r>
+              <w:t>ó</w:t>
+            </w:r>
+            <w:r>
+              <w:t>dcast analiza el funcionamiento, los riesgos y el uso responsable de la inteligencia artificial, especialmente de los modelos de lenguaje de gran escala. Para introducir el tema, se menciona el caso Mata contra Avianca, ocurrido en 2023, donde unos abogados presentaron ante un juez federal en Nueva York un documento legal con citas de casos judiciales inexistentes, generadas por una inteligencia artificial. Este ejemplo permite evidenciar uno de los principales peligros de estas herramientas: la capacidad de producir textos muy fluidos, convincentes y aparentemente profesionales, aunque no necesariamente verdaderos.</w:t>
             </w:r>
           </w:p>
           <w:p>
             <w:r>
-              <w:t>La idea central del audio es que la inteligencia artificial no debe entenderse como una mente humana ni como una herramienta infalible, sino como un motor probabilístico. Es decir, estos sistemas no comprenden el lenguaje de la misma forma en que lo hace una persona, sino que procesan grandes cantidades de datos y predicen cuál es la siguiente palabra o fragmento de texto más probable. Para ello utilizan unidades llamadas tokens, que pueden ser palabras, sílabas o letras. A partir de esos tokens, el modelo construye respuestas que suenan coherentes, aunque no siempre estén basadas en hechos reales.</w:t>
+              <w:t xml:space="preserve">La idea central del audio es que la inteligencia artificial no debe entenderse como una mente humana ni como una herramienta infalible, sino como un motor probabilístico. Es decir, estos sistemas no comprenden el lenguaje de la misma forma en que lo hace una persona, sino que procesan grandes cantidades de datos y predicen cuál es la siguiente palabra o fragmento de texto más probable. Para ello utilizan unidades llamadas </w:t>
+            </w:r>
+            <w:r>
+              <w:rPr>
+                <w:rStyle w:val="Extranjerismo"/>
+              </w:rPr>
+              <w:t>tokens</w:t>
+            </w:r>
+            <w:r>
+              <w:t xml:space="preserve">, que pueden ser palabras, sílabas o letras. A partir de esos </w:t>
+            </w:r>
+            <w:r>
+              <w:rPr>
+                <w:rStyle w:val="Extranjerismo"/>
+              </w:rPr>
+              <w:t>tokens</w:t>
+            </w:r>
+            <w:r>
+              <w:t>, el modelo construye respuestas que suenan coherentes, aunque no siempre estén basadas en hechos reales.</w:t>
             </w:r>
           </w:p>
           <w:p>
@@ -10445,26 +10937,34 @@
           <w:p>
             <w:r>
               <w:lastRenderedPageBreak/>
-              <w:t>El podcast también diferencia entre dos tipos de inteligencia artificial. Por un lado, está la inteligencia artificial paramétrica, conocida como modelo de “libro cerrado”, cuyo conocimiento depende de la información con la que fue entrenada. Este tipo de modelo no necesariamente consulta datos actualizados ni verifica la realidad. Por otro lado, se explica la arquitectura RAG, o generación aumentada por recuperación, entendida como un modelo de “libro abierto”. Este sistema primero recupera información de documentos o bases de datos confiables y luego genera una respuesta con base en esa información, reduciendo el riesgo de inventar datos.</w:t>
+              <w:t>El p</w:t>
+            </w:r>
+            <w:r>
+              <w:t>ó</w:t>
+            </w:r>
+            <w:r>
+              <w:t>dcast también diferencia entre dos tipos de inteligencia artificial. Por un lado, está la inteligencia artificial paramétrica, conocida como modelo de “libro cerrado”, cuyo conocimiento depende de la información con la que fue entrenada. Este tipo de modelo no necesariamente consulta datos actualizados ni verifica la realidad. Por otro lado, se explica la arquitectura RAG, o generación aumentada por recuperación, entendida como un modelo de “libro abierto”. Este sistema primero recupera información de documentos o bases de datos confiables y luego genera una respuesta con base en esa información, reduciendo el riesgo de inventar datos.</w:t>
             </w:r>
           </w:p>
           <w:p>
             <w:r>
               <w:t xml:space="preserve">Otro aspecto fundamental del audio es la importancia de formular correctamente las instrucciones o </w:t>
             </w:r>
-            <w:proofErr w:type="spellStart"/>
-            <w:r>
+            <w:r>
+              <w:rPr>
+                <w:rStyle w:val="Extranjerismo"/>
+              </w:rPr>
               <w:t>prompts</w:t>
             </w:r>
-            <w:proofErr w:type="spellEnd"/>
             <w:r>
               <w:t xml:space="preserve">. El podcast explica que muchas personas cometen el error de usar la inteligencia artificial como si fuera un buscador tradicional, escribiendo frases sueltas y esperando una respuesta perfecta. Sin embargo, un </w:t>
             </w:r>
-            <w:proofErr w:type="spellStart"/>
-            <w:r>
+            <w:r>
+              <w:rPr>
+                <w:rStyle w:val="Extranjerismo"/>
+              </w:rPr>
               <w:t>prompt</w:t>
             </w:r>
-            <w:proofErr w:type="spellEnd"/>
             <w:r>
               <w:t xml:space="preserve"> debe ser una estructura clara que oriente el comportamiento del modelo. Para ello, se proponen cuatro elementos esenciales: la instrucción, el contexto, las restricciones y el formato de salida.</w:t>
             </w:r>
@@ -10473,11 +10973,9 @@
             <w:r>
               <w:t xml:space="preserve">La instrucción debe indicar claramente qué se espera que haga la inteligencia artificial, usando verbos como analizar, sintetizar, clasificar o redactar. El contexto permite definir desde qué rol o enfoque debe responder el sistema. Las restricciones delimitan la información que puede usar, evitando que incluya datos externos o inventados. Finalmente, el formato de salida define cómo debe presentarse la respuesta, por </w:t>
             </w:r>
-            <w:proofErr w:type="gramStart"/>
-            <w:r>
-              <w:t>ejemplo</w:t>
-            </w:r>
-            <w:proofErr w:type="gramEnd"/>
+            <w:r>
+              <w:t>ejemplo,</w:t>
+            </w:r>
             <w:r>
               <w:t xml:space="preserve"> en tabla, lista, informe o resumen ejecutivo.</w:t>
             </w:r>
@@ -10486,19 +10984,12 @@
             <w:r>
               <w:t xml:space="preserve">El audio también presenta técnicas avanzadas para mejorar el uso de la inteligencia artificial. Una de ellas es el </w:t>
             </w:r>
-            <w:proofErr w:type="spellStart"/>
-            <w:r>
-              <w:t>few-shot</w:t>
-            </w:r>
-            <w:proofErr w:type="spellEnd"/>
-            <w:r>
-              <w:t xml:space="preserve"> </w:t>
-            </w:r>
-            <w:proofErr w:type="spellStart"/>
-            <w:r>
-              <w:t>prompting</w:t>
-            </w:r>
-            <w:proofErr w:type="spellEnd"/>
+            <w:r>
+              <w:rPr>
+                <w:rStyle w:val="Extranjerismo"/>
+              </w:rPr>
+              <w:t>few-shot prompting</w:t>
+            </w:r>
             <w:r>
               <w:t xml:space="preserve">, que consiste en dar </w:t>
             </w:r>
@@ -10509,7 +11000,13 @@
           </w:p>
           <w:p>
             <w:r>
-              <w:t>En conclusión, el podcast plantea que la inteligencia artificial es una herramienta poderosa, pero requiere supervisión humana, criterio profesional y precisión comunicativa. No reemplaza el rigor del ser humano; por el contrario, lo exige más que nunca. Su utilidad depende de la capacidad del usuario para formular instrucciones claras, verificar los resultados y asumir la responsabilidad de las decisiones finales. El futuro apunta hacia sistemas más autónomos, pero el juicio crítico, la ética y la responsabilidad seguirán siendo funciones humanas indispensables.</w:t>
+              <w:t>En conclusión, el p</w:t>
+            </w:r>
+            <w:r>
+              <w:t>ó</w:t>
+            </w:r>
+            <w:r>
+              <w:t>dcast plantea que la inteligencia artificial es una herramienta poderosa, pero requiere supervisión humana, criterio profesional y precisión comunicativa. No reemplaza el rigor del ser humano; por el contrario, lo exige más que nunca. Su utilidad depende de la capacidad del usuario para formular instrucciones claras, verificar los resultados y asumir la responsabilidad de las decisiones finales. El futuro apunta hacia sistemas más autónomos, pero el juicio crítico, la ética y la responsabilidad seguirán siendo funciones humanas indispensables.</w:t>
             </w:r>
           </w:p>
         </w:tc>
@@ -10723,13 +11220,6 @@
         </w:rPr>
         <w:t>La incorporación de estas estrategias mejora la estabilidad del sistema, fortalece la trazabilidad de las respuestas y reduce significativamente el riesgo de alucinaciones generadas por el modelo.</w:t>
       </w:r>
-    </w:p>
-    <w:p>
-      <w:pPr>
-        <w:rPr>
-          <w:lang w:eastAsia="es-CO"/>
-        </w:rPr>
-      </w:pPr>
     </w:p>
     <w:p>
       <w:pPr>
@@ -10758,6 +11248,7 @@
         </w:rPr>
         <w:t>¿Qué son los '</w:t>
       </w:r>
+      <w:proofErr w:type="spellStart"/>
       <w:r>
         <w:rPr>
           <w:rStyle w:val="Extranjerismo"/>
@@ -10765,15 +11256,18 @@
           <w:bCs/>
           <w:sz w:val="32"/>
           <w:szCs w:val="32"/>
+          <w:lang w:val="es-ES"/>
         </w:rPr>
         <w:t>rails</w:t>
       </w:r>
+      <w:proofErr w:type="spellEnd"/>
       <w:r>
         <w:rPr>
           <w:rStyle w:val="Ttulo3Car"/>
         </w:rPr>
         <w:t xml:space="preserve">' o vías de control en los </w:t>
       </w:r>
+      <w:proofErr w:type="spellStart"/>
       <w:r>
         <w:rPr>
           <w:rStyle w:val="Extranjerismo"/>
@@ -10781,9 +11275,11 @@
           <w:bCs/>
           <w:sz w:val="32"/>
           <w:szCs w:val="32"/>
+          <w:lang w:val="es-ES"/>
         </w:rPr>
         <w:t>prompts</w:t>
       </w:r>
+      <w:proofErr w:type="spellEnd"/>
       <w:r>
         <w:rPr>
           <w:rStyle w:val="Ttulo3Car"/>
@@ -10803,26 +11299,30 @@
         </w:rPr>
         <w:t xml:space="preserve"> En el contexto de la ingeniería de </w:t>
       </w:r>
-      <w:r>
-        <w:rPr>
-          <w:rStyle w:val="Extranjerismo"/>
+      <w:proofErr w:type="spellStart"/>
+      <w:r>
+        <w:rPr>
+          <w:rStyle w:val="Extranjerismo"/>
+          <w:lang w:val="es-ES" w:eastAsia="es-CO"/>
+        </w:rPr>
+        <w:t>prompts</w:t>
+      </w:r>
+      <w:proofErr w:type="spellEnd"/>
+      <w:r>
+        <w:rPr>
           <w:lang w:eastAsia="es-CO"/>
         </w:rPr>
-        <w:t>prompts</w:t>
-      </w:r>
-      <w:r>
-        <w:rPr>
-          <w:lang w:eastAsia="es-CO"/>
-        </w:rPr>
         <w:t xml:space="preserve">, los </w:t>
       </w:r>
-      <w:r>
-        <w:rPr>
-          <w:rStyle w:val="Extranjerismo"/>
-          <w:lang w:eastAsia="es-CO"/>
+      <w:proofErr w:type="spellStart"/>
+      <w:r>
+        <w:rPr>
+          <w:rStyle w:val="Extranjerismo"/>
+          <w:lang w:val="es-ES" w:eastAsia="es-CO"/>
         </w:rPr>
         <w:t>rails</w:t>
       </w:r>
+      <w:proofErr w:type="spellEnd"/>
       <w:r>
         <w:rPr>
           <w:lang w:eastAsia="es-CO"/>
@@ -10844,7 +11344,20 @@
           <w:lang w:eastAsia="es-CO"/>
         </w:rPr>
         <w:tab/>
-        <w:t>El propósito principal de esta técnica consiste en limitar el espacio de posibles respuestas del modelo, garantizando que el output permanezca dentro de parámetros temáticos, éticos y de veracidad previamente establecidos.</w:t>
+        <w:t xml:space="preserve">El propósito principal de esta técnica consiste en limitar el espacio de posibles respuestas del modelo, garantizando que el </w:t>
+      </w:r>
+      <w:r>
+        <w:rPr>
+          <w:rStyle w:val="Extranjerismo"/>
+          <w:lang w:eastAsia="es-CO"/>
+        </w:rPr>
+        <w:t xml:space="preserve">output </w:t>
+      </w:r>
+      <w:r>
+        <w:rPr>
+          <w:lang w:eastAsia="es-CO"/>
+        </w:rPr>
+        <w:t>permanezca dentro de parámetros temáticos, éticos y de veracidad previamente establecidos.</w:t>
       </w:r>
     </w:p>
     <w:p>
@@ -10862,26 +11375,30 @@
         </w:rPr>
         <w:t xml:space="preserve">En términos operativos, los </w:t>
       </w:r>
-      <w:r>
-        <w:rPr>
-          <w:rStyle w:val="Extranjerismo"/>
+      <w:proofErr w:type="spellStart"/>
+      <w:r>
+        <w:rPr>
+          <w:rStyle w:val="Extranjerismo"/>
+          <w:lang w:val="es-ES" w:eastAsia="es-CO"/>
+        </w:rPr>
+        <w:t>rails</w:t>
+      </w:r>
+      <w:proofErr w:type="spellEnd"/>
+      <w:r>
+        <w:rPr>
           <w:lang w:eastAsia="es-CO"/>
         </w:rPr>
-        <w:t>rails</w:t>
-      </w:r>
-      <w:r>
-        <w:rPr>
-          <w:lang w:eastAsia="es-CO"/>
-        </w:rPr>
         <w:t xml:space="preserve"> funcionan como principios de control codificados mediante instrucciones explícitas y mandatos imperativos dentro del </w:t>
       </w:r>
-      <w:r>
-        <w:rPr>
-          <w:rStyle w:val="Extranjerismo"/>
-          <w:lang w:eastAsia="es-CO"/>
+      <w:proofErr w:type="spellStart"/>
+      <w:r>
+        <w:rPr>
+          <w:rStyle w:val="Extranjerismo"/>
+          <w:lang w:val="es-ES" w:eastAsia="es-CO"/>
         </w:rPr>
         <w:t>prompt</w:t>
       </w:r>
+      <w:proofErr w:type="spellEnd"/>
       <w:r>
         <w:rPr>
           <w:lang w:eastAsia="es-CO"/>
@@ -10937,13 +11454,15 @@
         </w:rPr>
         <w:t xml:space="preserve"> En entornos corporativos y de alta precisión, los </w:t>
       </w:r>
-      <w:r>
-        <w:rPr>
-          <w:rStyle w:val="Extranjerismo"/>
-          <w:lang w:eastAsia="es-CO"/>
+      <w:proofErr w:type="spellStart"/>
+      <w:r>
+        <w:rPr>
+          <w:rStyle w:val="Extranjerismo"/>
+          <w:lang w:val="es-ES" w:eastAsia="es-CO"/>
         </w:rPr>
         <w:t>rails</w:t>
       </w:r>
+      <w:proofErr w:type="spellEnd"/>
       <w:r>
         <w:rPr>
           <w:lang w:eastAsia="es-CO"/>
@@ -10970,10 +11489,9 @@
       <w:pPr>
         <w:pStyle w:val="Prrafodelista"/>
         <w:numPr>
-          <w:ilvl w:val="0"/>
+          <w:ilvl w:val="1"/>
           <w:numId w:val="33"/>
         </w:numPr>
-        <w:ind w:left="993"/>
         <w:rPr>
           <w:lang w:eastAsia="es-CO"/>
         </w:rPr>
@@ -11013,10 +11531,9 @@
       <w:pPr>
         <w:pStyle w:val="Prrafodelista"/>
         <w:numPr>
-          <w:ilvl w:val="0"/>
+          <w:ilvl w:val="1"/>
           <w:numId w:val="33"/>
         </w:numPr>
-        <w:ind w:left="993"/>
         <w:rPr>
           <w:lang w:eastAsia="es-CO"/>
         </w:rPr>
@@ -11090,10 +11607,9 @@
       <w:pPr>
         <w:pStyle w:val="Prrafodelista"/>
         <w:numPr>
-          <w:ilvl w:val="0"/>
+          <w:ilvl w:val="1"/>
           <w:numId w:val="33"/>
         </w:numPr>
-        <w:ind w:left="993"/>
         <w:rPr>
           <w:lang w:eastAsia="es-CO"/>
         </w:rPr>
@@ -11166,31 +11682,40 @@
         </w:rPr>
         <w:t xml:space="preserve">La implementación adecuada de </w:t>
       </w:r>
-      <w:r>
-        <w:rPr>
-          <w:rStyle w:val="Extranjerismo"/>
+      <w:proofErr w:type="spellStart"/>
+      <w:r>
+        <w:rPr>
+          <w:rStyle w:val="Extranjerismo"/>
+          <w:lang w:val="es-ES" w:eastAsia="es-CO"/>
+        </w:rPr>
+        <w:t>rails</w:t>
+      </w:r>
+      <w:proofErr w:type="spellEnd"/>
+      <w:r>
+        <w:rPr>
           <w:lang w:eastAsia="es-CO"/>
         </w:rPr>
-        <w:t>rails</w:t>
-      </w:r>
-      <w:r>
+        <w:t xml:space="preserve"> fortalece la gobernanza de sistemas de IA y mejora la confiabilidad de las respuestas generadas en contextos empresariales, jurídicos, académicos y administrativos.</w:t>
+      </w:r>
+    </w:p>
+    <w:p>
+      <w:pPr>
         <w:rPr>
           <w:lang w:eastAsia="es-CO"/>
         </w:rPr>
-        <w:t xml:space="preserve"> fortalece la gobernanza de sistemas de IA y mejora la confiabilidad de las respuestas generadas en contextos empresariales, jurídicos, académicos y administrativos.</w:t>
-      </w:r>
-    </w:p>
-    <w:p>
-      <w:pPr>
+      </w:pPr>
+      <w:r>
         <w:rPr>
           <w:lang w:eastAsia="es-CO"/>
         </w:rPr>
-      </w:pPr>
+        <w:t xml:space="preserve">Asimismo, estas técnicas constituyen un componente fundamental en arquitecturas modernas orientadas a minimizar riesgos de alucinación, proteger </w:t>
+      </w:r>
       <w:r>
         <w:rPr>
           <w:lang w:eastAsia="es-CO"/>
         </w:rPr>
-        <w:t>Asimismo, estas técnicas constituyen un componente fundamental en arquitecturas modernas orientadas a minimizar riesgos de alucinación, proteger información sensible y garantizar un comportamiento alineado con criterios éticos y regulatorios.</w:t>
+        <w:lastRenderedPageBreak/>
+        <w:t>información sensible y garantizar un comportamiento alineado con criterios éticos y regulatorios.</w:t>
       </w:r>
     </w:p>
     <w:p>
@@ -11209,7 +11734,6 @@
         <w:rPr>
           <w:rStyle w:val="Ttulo4Car"/>
         </w:rPr>
-        <w:lastRenderedPageBreak/>
         <w:t>Implementación y el “silencio estratégico”.</w:t>
       </w:r>
       <w:r>
@@ -11218,13 +11742,15 @@
         </w:rPr>
         <w:t xml:space="preserve"> Una de las aplicaciones más avanzadas de los </w:t>
       </w:r>
-      <w:r>
-        <w:rPr>
-          <w:rStyle w:val="Extranjerismo"/>
-          <w:lang w:eastAsia="es-CO"/>
+      <w:proofErr w:type="spellStart"/>
+      <w:r>
+        <w:rPr>
+          <w:rStyle w:val="Extranjerismo"/>
+          <w:lang w:val="es-ES" w:eastAsia="es-CO"/>
         </w:rPr>
         <w:t>rails</w:t>
       </w:r>
+      <w:proofErr w:type="spellEnd"/>
       <w:r>
         <w:rPr>
           <w:lang w:eastAsia="es-CO"/>
@@ -11236,10 +11762,9 @@
       <w:pPr>
         <w:pStyle w:val="Prrafodelista"/>
         <w:numPr>
-          <w:ilvl w:val="0"/>
+          <w:ilvl w:val="1"/>
           <w:numId w:val="34"/>
         </w:numPr>
-        <w:ind w:left="993"/>
         <w:rPr>
           <w:lang w:eastAsia="es-CO"/>
         </w:rPr>
@@ -11261,10 +11786,9 @@
       <w:pPr>
         <w:pStyle w:val="Prrafodelista"/>
         <w:numPr>
-          <w:ilvl w:val="0"/>
+          <w:ilvl w:val="1"/>
           <w:numId w:val="34"/>
         </w:numPr>
-        <w:ind w:left="993"/>
         <w:rPr>
           <w:lang w:eastAsia="es-CO"/>
         </w:rPr>
@@ -11281,40 +11805,48 @@
         </w:rPr>
         <w:t xml:space="preserve"> En sectores de alta responsabilidad, como el jurídico o el de salud, los </w:t>
       </w:r>
-      <w:r>
-        <w:rPr>
-          <w:rStyle w:val="Extranjerismo"/>
+      <w:proofErr w:type="spellStart"/>
+      <w:r>
+        <w:rPr>
+          <w:rStyle w:val="Extranjerismo"/>
+          <w:lang w:val="es-ES" w:eastAsia="es-CO"/>
+        </w:rPr>
+        <w:t>rails</w:t>
+      </w:r>
+      <w:proofErr w:type="spellEnd"/>
+      <w:r>
+        <w:rPr>
+          <w:rStyle w:val="Extranjerismo"/>
+          <w:lang w:val="es-ES" w:eastAsia="es-CO"/>
+        </w:rPr>
+        <w:t xml:space="preserve"> </w:t>
+      </w:r>
+      <w:r>
+        <w:rPr>
           <w:lang w:eastAsia="es-CO"/>
         </w:rPr>
-        <w:t xml:space="preserve">rails </w:t>
-      </w:r>
-      <w:r>
+        <w:t>constituyen una capa de seguridad indispensable.</w:t>
+      </w:r>
+    </w:p>
+    <w:p>
+      <w:pPr>
         <w:rPr>
           <w:lang w:eastAsia="es-CO"/>
         </w:rPr>
-        <w:t>constituyen una capa de seguridad indispensable.</w:t>
-      </w:r>
-    </w:p>
-    <w:p>
-      <w:pPr>
+      </w:pPr>
+      <w:r>
         <w:rPr>
           <w:lang w:eastAsia="es-CO"/>
         </w:rPr>
-      </w:pPr>
-      <w:r>
-        <w:rPr>
+        <w:t xml:space="preserve">Por ejemplo: al solicitar el análisis de un contrato, pueden aplicarse </w:t>
+      </w:r>
+      <w:r>
+        <w:rPr>
+          <w:rStyle w:val="Extranjerismo"/>
           <w:lang w:eastAsia="es-CO"/>
         </w:rPr>
-        <w:t xml:space="preserve">Por ejemplo: al solicitar el análisis de un contrato, pueden aplicarse </w:t>
-      </w:r>
-      <w:proofErr w:type="spellStart"/>
-      <w:r>
-        <w:rPr>
-          <w:lang w:eastAsia="es-CO"/>
-        </w:rPr>
         <w:t>rails</w:t>
       </w:r>
-      <w:proofErr w:type="spellEnd"/>
       <w:r>
         <w:rPr>
           <w:lang w:eastAsia="es-CO"/>
@@ -11408,37 +11940,14 @@
     </w:p>
     <w:p>
       <w:pPr>
-        <w:tabs>
-          <w:tab w:val="left" w:pos="1155"/>
-        </w:tabs>
-        <w:rPr>
-          <w:lang w:eastAsia="es-CO"/>
-        </w:rPr>
-      </w:pPr>
-      <w:r>
-        <w:rPr>
-          <w:lang w:eastAsia="es-CO"/>
-        </w:rPr>
+        <w:pStyle w:val="Ttulo1"/>
+      </w:pPr>
+      <w:r>
+        <w:lastRenderedPageBreak/>
         <w:tab/>
       </w:r>
-    </w:p>
-    <w:p>
-      <w:pPr>
-        <w:tabs>
-          <w:tab w:val="left" w:pos="1155"/>
-        </w:tabs>
-        <w:rPr>
-          <w:lang w:eastAsia="es-CO"/>
-        </w:rPr>
-      </w:pPr>
-    </w:p>
-    <w:p>
-      <w:pPr>
-        <w:pStyle w:val="Ttulo1"/>
-      </w:pPr>
       <w:bookmarkStart w:id="17" w:name="_Toc233390493"/>
       <w:r>
-        <w:lastRenderedPageBreak/>
         <w:t>Optimización de instrucciones y automatización de tareas</w:t>
       </w:r>
       <w:bookmarkEnd w:id="17"/>
@@ -11738,6 +12247,7 @@
       <w:proofErr w:type="spellStart"/>
       <w:r>
         <w:rPr>
+          <w:rStyle w:val="Extranjerismo"/>
           <w:lang w:val="es-419" w:eastAsia="es-CO"/>
         </w:rPr>
         <w:t>Retrieval</w:t>
@@ -11830,10 +12340,9 @@
       <w:pPr>
         <w:pStyle w:val="Prrafodelista"/>
         <w:numPr>
-          <w:ilvl w:val="0"/>
+          <w:ilvl w:val="1"/>
           <w:numId w:val="36"/>
         </w:numPr>
-        <w:ind w:left="993"/>
         <w:rPr>
           <w:lang w:val="es-419" w:eastAsia="es-CO"/>
         </w:rPr>
@@ -11843,6 +12352,103 @@
           <w:lang w:val="es-419" w:eastAsia="es-CO"/>
         </w:rPr>
         <w:t>Escenario: un profesional de la salud requiere sintetizar las contraindicaciones de un conjunto de fármacos a partir de un repositorio de protocolos clínicos de 500 páginas.</w:t>
+      </w:r>
+    </w:p>
+    <w:p>
+      <w:pPr>
+        <w:pStyle w:val="Prrafodelista"/>
+        <w:numPr>
+          <w:ilvl w:val="1"/>
+          <w:numId w:val="36"/>
+        </w:numPr>
+        <w:rPr>
+          <w:lang w:val="es-419" w:eastAsia="es-CO"/>
+        </w:rPr>
+      </w:pPr>
+      <w:r>
+        <w:rPr>
+          <w:lang w:val="es-419" w:eastAsia="es-CO"/>
+        </w:rPr>
+        <w:t xml:space="preserve">Proceso técnico: se implementa un </w:t>
+      </w:r>
+      <w:proofErr w:type="spellStart"/>
+      <w:r>
+        <w:rPr>
+          <w:rStyle w:val="Extranjerismo"/>
+          <w:lang w:val="es-419" w:eastAsia="es-CO"/>
+        </w:rPr>
+        <w:t>super</w:t>
+      </w:r>
+      <w:r>
+        <w:rPr>
+          <w:lang w:val="es-419" w:eastAsia="es-CO"/>
+        </w:rPr>
+        <w:t>-</w:t>
+      </w:r>
+      <w:r>
+        <w:rPr>
+          <w:rStyle w:val="Extranjerismo"/>
+          <w:lang w:val="es-419" w:eastAsia="es-CO"/>
+        </w:rPr>
+        <w:t>prompt</w:t>
+      </w:r>
+      <w:proofErr w:type="spellEnd"/>
+      <w:r>
+        <w:rPr>
+          <w:lang w:val="es-419" w:eastAsia="es-CO"/>
+        </w:rPr>
+        <w:t xml:space="preserve"> que combina el patrón Persona (farmacólogo clínico) con una técnica de </w:t>
+      </w:r>
+      <w:r>
+        <w:rPr>
+          <w:rStyle w:val="Extranjerismo"/>
+          <w:lang w:val="es-419" w:eastAsia="es-CO"/>
+        </w:rPr>
+        <w:t>Chain-</w:t>
+      </w:r>
+      <w:proofErr w:type="spellStart"/>
+      <w:r>
+        <w:rPr>
+          <w:rStyle w:val="Extranjerismo"/>
+          <w:lang w:val="es-419" w:eastAsia="es-CO"/>
+        </w:rPr>
+        <w:t>of</w:t>
+      </w:r>
+      <w:proofErr w:type="spellEnd"/>
+      <w:r>
+        <w:rPr>
+          <w:rStyle w:val="Extranjerismo"/>
+          <w:lang w:val="es-419" w:eastAsia="es-CO"/>
+        </w:rPr>
+        <w:t>-</w:t>
+      </w:r>
+      <w:proofErr w:type="spellStart"/>
+      <w:r>
+        <w:rPr>
+          <w:rStyle w:val="Extranjerismo"/>
+          <w:lang w:val="es-419" w:eastAsia="es-CO"/>
+        </w:rPr>
+        <w:t>Thought</w:t>
+      </w:r>
+      <w:proofErr w:type="spellEnd"/>
+      <w:r>
+        <w:rPr>
+          <w:lang w:val="es-419" w:eastAsia="es-CO"/>
+        </w:rPr>
+        <w:t>. La instrucción aplicada es:</w:t>
+      </w:r>
+    </w:p>
+    <w:p>
+      <w:pPr>
+        <w:rPr>
+          <w:lang w:val="es-419" w:eastAsia="es-CO"/>
+        </w:rPr>
+      </w:pPr>
+      <w:r>
+        <w:rPr>
+          <w:lang w:val="es-419" w:eastAsia="es-CO"/>
+        </w:rPr>
+        <w:t>“Analice secuencialmente cada protocolo; identifique interacciones críticas; genere un cuadro comparativo de riesgos”.</w:t>
       </w:r>
     </w:p>
     <w:p>
@@ -11861,28 +12467,70 @@
         <w:rPr>
           <w:lang w:val="es-419" w:eastAsia="es-CO"/>
         </w:rPr>
-        <w:t xml:space="preserve">Proceso técnico: se implementa un </w:t>
+        <w:t>Resultado: el profesional reduce el tiempo de investigación manual de varias horas a pocos minutos, obteniendo una síntesis técnica útil para apoyar la toma de decisiones clínicas.</w:t>
+      </w:r>
+    </w:p>
+    <w:p>
+      <w:pPr>
+        <w:rPr>
+          <w:lang w:val="es-419" w:eastAsia="es-CO"/>
+        </w:rPr>
+      </w:pPr>
+      <w:r>
+        <w:rPr>
+          <w:lang w:val="es-419" w:eastAsia="es-CO"/>
+        </w:rPr>
+        <w:t>La combinación entre técnicas de refinamiento, recuperación documental y razonamiento estructurado permite optimizar procesos de análisis en entornos de alta complejidad informativa. Estas capacidades convierten a la IAG en una herramienta estratégica para automatización, apoyo experto y mejora continua dentro de organizaciones orientadas a la transformación digital.</w:t>
+      </w:r>
+    </w:p>
+    <w:p>
+      <w:pPr>
+        <w:pStyle w:val="Ttulo2"/>
+        <w:rPr>
+          <w:rStyle w:val="Extranjerismo"/>
+          <w:lang w:val="es-419"/>
+        </w:rPr>
+      </w:pPr>
+      <w:bookmarkStart w:id="20" w:name="_Toc233390496"/>
+      <w:r>
+        <w:t xml:space="preserve">Introducción a la automatización de flujos de trabajo mediante </w:t>
       </w:r>
       <w:proofErr w:type="spellStart"/>
       <w:r>
         <w:rPr>
-          <w:lang w:val="es-419" w:eastAsia="es-CO"/>
-        </w:rPr>
-        <w:t>super-prompt</w:t>
-      </w:r>
+          <w:rStyle w:val="Extranjerismo"/>
+          <w:lang w:val="es-419"/>
+        </w:rPr>
+        <w:t>prompts</w:t>
+      </w:r>
+      <w:bookmarkEnd w:id="20"/>
       <w:proofErr w:type="spellEnd"/>
-      <w:r>
-        <w:rPr>
-          <w:lang w:val="es-419" w:eastAsia="es-CO"/>
-        </w:rPr>
-        <w:t xml:space="preserve"> que combina el patrón Persona (farmacólogo clínico) con una técnica de </w:t>
-      </w:r>
-      <w:r>
-        <w:rPr>
-          <w:rStyle w:val="Extranjerismo"/>
-          <w:lang w:val="es-419" w:eastAsia="es-CO"/>
-        </w:rPr>
-        <w:t>Chain-</w:t>
+    </w:p>
+    <w:p>
+      <w:pPr>
+        <w:rPr>
+          <w:lang w:val="es-419" w:eastAsia="es-CO"/>
+        </w:rPr>
+      </w:pPr>
+      <w:r>
+        <w:rPr>
+          <w:lang w:val="es-419" w:eastAsia="es-CO"/>
+        </w:rPr>
+        <w:t xml:space="preserve">La automatización representa el nivel más avanzado de madurez tecnológica en el uso de la inteligencia artificial generativa (IAG). Este enfoque se fundamenta en el </w:t>
+      </w:r>
+      <w:r>
+        <w:rPr>
+          <w:lang w:val="es-419" w:eastAsia="es-CO"/>
+        </w:rPr>
+        <w:lastRenderedPageBreak/>
+        <w:t xml:space="preserve">patrón </w:t>
+      </w:r>
+      <w:r>
+        <w:rPr>
+          <w:rStyle w:val="Extranjerismo"/>
+          <w:lang w:val="es-419" w:eastAsia="es-CO"/>
+        </w:rPr>
+        <w:t xml:space="preserve">Output </w:t>
       </w:r>
       <w:proofErr w:type="spellStart"/>
       <w:r>
@@ -11890,15 +12538,14 @@
           <w:rStyle w:val="Extranjerismo"/>
           <w:lang w:val="es-419" w:eastAsia="es-CO"/>
         </w:rPr>
-        <w:t>of</w:t>
+        <w:t>Automater</w:t>
       </w:r>
       <w:proofErr w:type="spellEnd"/>
       <w:r>
         <w:rPr>
-          <w:rStyle w:val="Extranjerismo"/>
-          <w:lang w:val="es-419" w:eastAsia="es-CO"/>
-        </w:rPr>
-        <w:t>-</w:t>
+          <w:lang w:val="es-419" w:eastAsia="es-CO"/>
+        </w:rPr>
+        <w:t xml:space="preserve">, donde el resultado del </w:t>
       </w:r>
       <w:proofErr w:type="spellStart"/>
       <w:r>
@@ -11906,27 +12553,106 @@
           <w:rStyle w:val="Extranjerismo"/>
           <w:lang w:val="es-419" w:eastAsia="es-CO"/>
         </w:rPr>
-        <w:t>Thought</w:t>
+        <w:t>prompt</w:t>
       </w:r>
       <w:proofErr w:type="spellEnd"/>
       <w:r>
         <w:rPr>
           <w:lang w:val="es-419" w:eastAsia="es-CO"/>
         </w:rPr>
-        <w:t>. La instrucción aplicada es:</w:t>
-      </w:r>
-    </w:p>
-    <w:p>
-      <w:pPr>
-        <w:rPr>
-          <w:lang w:val="es-419" w:eastAsia="es-CO"/>
-        </w:rPr>
-      </w:pPr>
-      <w:r>
-        <w:rPr>
-          <w:lang w:val="es-419" w:eastAsia="es-CO"/>
-        </w:rPr>
-        <w:t>“Analice secuencialmente cada protocolo; identifique interacciones críticas; genere un cuadro comparativo de riesgos”.</w:t>
+        <w:t xml:space="preserve"> no corresponde únicamente a una respuesta narrativa, sino a un artefacto técnico capaz de ejecutar acciones en otros sistemas de forma automatizada.</w:t>
+      </w:r>
+    </w:p>
+    <w:p>
+      <w:pPr>
+        <w:rPr>
+          <w:lang w:val="es-419" w:eastAsia="es-CO"/>
+        </w:rPr>
+      </w:pPr>
+      <w:r>
+        <w:rPr>
+          <w:lang w:val="es-419" w:eastAsia="es-CO"/>
+        </w:rPr>
+        <w:t xml:space="preserve">Estos artefactos pueden incluir </w:t>
+      </w:r>
+      <w:r>
+        <w:rPr>
+          <w:rStyle w:val="Extranjerismo"/>
+          <w:lang w:val="es-419" w:eastAsia="es-CO"/>
+        </w:rPr>
+        <w:t>scripts</w:t>
+      </w:r>
+      <w:r>
+        <w:rPr>
+          <w:lang w:val="es-419" w:eastAsia="es-CO"/>
+        </w:rPr>
+        <w:t xml:space="preserve"> de programación, archivos estructurados o instrucciones técnicas orientadas a interactuar con sistemas operativos, bases de datos o interfaces de programación de aplicaciones (</w:t>
+      </w:r>
+      <w:proofErr w:type="spellStart"/>
+      <w:r>
+        <w:rPr>
+          <w:rStyle w:val="Extranjerismo"/>
+          <w:lang w:val="es-419" w:eastAsia="es-CO"/>
+        </w:rPr>
+        <w:t>Application</w:t>
+      </w:r>
+      <w:proofErr w:type="spellEnd"/>
+      <w:r>
+        <w:rPr>
+          <w:rStyle w:val="Extranjerismo"/>
+          <w:lang w:val="es-419" w:eastAsia="es-CO"/>
+        </w:rPr>
+        <w:t xml:space="preserve"> </w:t>
+      </w:r>
+      <w:proofErr w:type="spellStart"/>
+      <w:r>
+        <w:rPr>
+          <w:rStyle w:val="Extranjerismo"/>
+          <w:lang w:val="es-419" w:eastAsia="es-CO"/>
+        </w:rPr>
+        <w:t>Programming</w:t>
+      </w:r>
+      <w:proofErr w:type="spellEnd"/>
+      <w:r>
+        <w:rPr>
+          <w:rStyle w:val="Extranjerismo"/>
+          <w:lang w:val="es-419" w:eastAsia="es-CO"/>
+        </w:rPr>
+        <w:t xml:space="preserve"> Interfaces </w:t>
+      </w:r>
+      <w:r>
+        <w:rPr>
+          <w:lang w:val="es-419" w:eastAsia="es-CO"/>
+        </w:rPr>
+        <w:t>[API]).</w:t>
+      </w:r>
+    </w:p>
+    <w:p>
+      <w:pPr>
+        <w:rPr>
+          <w:lang w:val="es-419" w:eastAsia="es-CO"/>
+        </w:rPr>
+      </w:pPr>
+      <w:r>
+        <w:rPr>
+          <w:lang w:val="es-419" w:eastAsia="es-CO"/>
+        </w:rPr>
+        <w:t xml:space="preserve">Mediante la ingeniería de </w:t>
+      </w:r>
+      <w:proofErr w:type="spellStart"/>
+      <w:r>
+        <w:rPr>
+          <w:rStyle w:val="Extranjerismo"/>
+          <w:lang w:val="es-419" w:eastAsia="es-CO"/>
+        </w:rPr>
+        <w:t>prompts</w:t>
+      </w:r>
+      <w:proofErr w:type="spellEnd"/>
+      <w:r>
+        <w:rPr>
+          <w:lang w:val="es-419" w:eastAsia="es-CO"/>
+        </w:rPr>
+        <w:t>, es posible diseñar flujos de trabajo destinados a automatizar tareas repetitivas de baja complejidad cognitiva y alto consumo de tiempo operativo. A continuación, se presentan algunos ejemplos de automatización mediante IA:</w:t>
       </w:r>
     </w:p>
     <w:p>
@@ -11943,181 +12669,15 @@
       </w:pPr>
       <w:r>
         <w:rPr>
-          <w:lang w:val="es-419" w:eastAsia="es-CO"/>
-        </w:rPr>
-        <w:t>Resultado: el profesional reduce el tiempo de investigación manual de varias horas a pocos minutos, obteniendo una síntesis técnica útil para apoyar la toma de decisiones clínicas.</w:t>
-      </w:r>
-    </w:p>
-    <w:p>
-      <w:pPr>
-        <w:rPr>
-          <w:lang w:val="es-419" w:eastAsia="es-CO"/>
-        </w:rPr>
-      </w:pPr>
-      <w:r>
-        <w:rPr>
-          <w:lang w:val="es-419" w:eastAsia="es-CO"/>
-        </w:rPr>
-        <w:t>La combinación entre técnicas de refinamiento, recuperación documental y razonamiento estructurado permite optimizar procesos de análisis en entornos de alta complejidad informativa. Estas capacidades convierten a la IAG en una herramienta estratégica para automatización, apoyo experto y mejora continua dentro de organizaciones orientadas a la transformación digital.</w:t>
-      </w:r>
-    </w:p>
-    <w:p>
-      <w:pPr>
-        <w:pStyle w:val="Ttulo2"/>
-        <w:rPr>
-          <w:rStyle w:val="Extranjerismo"/>
-          <w:lang w:val="es-419"/>
-        </w:rPr>
-      </w:pPr>
-      <w:bookmarkStart w:id="20" w:name="_Toc233390496"/>
-      <w:r>
-        <w:t xml:space="preserve">Introducción a la automatización de flujos de trabajo mediante </w:t>
-      </w:r>
-      <w:proofErr w:type="spellStart"/>
-      <w:r>
-        <w:rPr>
-          <w:rStyle w:val="Extranjerismo"/>
-          <w:lang w:val="es-419"/>
-        </w:rPr>
-        <w:t>prompts</w:t>
-      </w:r>
-      <w:bookmarkEnd w:id="20"/>
-      <w:proofErr w:type="spellEnd"/>
-    </w:p>
-    <w:p>
-      <w:pPr>
-        <w:rPr>
-          <w:lang w:val="es-419" w:eastAsia="es-CO"/>
-        </w:rPr>
-      </w:pPr>
-      <w:r>
-        <w:rPr>
-          <w:lang w:val="es-419" w:eastAsia="es-CO"/>
-        </w:rPr>
-        <w:t xml:space="preserve">La automatización representa el nivel más avanzado de madurez tecnológica en el uso de la inteligencia artificial generativa (IAG). Este enfoque se fundamenta en el </w:t>
-      </w:r>
-      <w:r>
-        <w:rPr>
-          <w:lang w:val="es-419" w:eastAsia="es-CO"/>
-        </w:rPr>
-        <w:lastRenderedPageBreak/>
-        <w:t xml:space="preserve">patrón </w:t>
-      </w:r>
-      <w:r>
-        <w:rPr>
-          <w:rStyle w:val="Extranjerismo"/>
-          <w:lang w:val="es-419" w:eastAsia="es-CO"/>
-        </w:rPr>
-        <w:t xml:space="preserve">Output </w:t>
-      </w:r>
-      <w:proofErr w:type="spellStart"/>
-      <w:r>
-        <w:rPr>
-          <w:rStyle w:val="Extranjerismo"/>
-          <w:lang w:val="es-419" w:eastAsia="es-CO"/>
-        </w:rPr>
-        <w:t>Automater</w:t>
-      </w:r>
-      <w:proofErr w:type="spellEnd"/>
-      <w:r>
-        <w:rPr>
-          <w:lang w:val="es-419" w:eastAsia="es-CO"/>
-        </w:rPr>
-        <w:t xml:space="preserve">, donde el resultado del </w:t>
-      </w:r>
-      <w:proofErr w:type="spellStart"/>
-      <w:r>
-        <w:rPr>
-          <w:rStyle w:val="Extranjerismo"/>
-          <w:lang w:val="es-419" w:eastAsia="es-CO"/>
-        </w:rPr>
-        <w:t>prompt</w:t>
-      </w:r>
-      <w:proofErr w:type="spellEnd"/>
-      <w:r>
-        <w:rPr>
-          <w:lang w:val="es-419" w:eastAsia="es-CO"/>
-        </w:rPr>
-        <w:t xml:space="preserve"> no corresponde únicamente a una respuesta narrativa, sino a un artefacto técnico capaz de ejecutar acciones en otros sistemas de forma automatizada.</w:t>
-      </w:r>
-    </w:p>
-    <w:p>
-      <w:pPr>
-        <w:rPr>
-          <w:lang w:val="es-419" w:eastAsia="es-CO"/>
-        </w:rPr>
-      </w:pPr>
-      <w:r>
-        <w:rPr>
-          <w:lang w:val="es-419" w:eastAsia="es-CO"/>
-        </w:rPr>
-        <w:t>Estos artefactos pueden incluir scripts de programación, archivos estructurados o instrucciones técnicas orientadas a interactuar con sistemas operativos, bases de datos o interfaces de programación de aplicaciones (</w:t>
-      </w:r>
-      <w:proofErr w:type="spellStart"/>
-      <w:r>
-        <w:rPr>
-          <w:rStyle w:val="Extranjerismo"/>
-          <w:lang w:val="es-419" w:eastAsia="es-CO"/>
-        </w:rPr>
-        <w:t>Application</w:t>
-      </w:r>
-      <w:proofErr w:type="spellEnd"/>
-      <w:r>
-        <w:rPr>
-          <w:rStyle w:val="Extranjerismo"/>
-          <w:lang w:val="es-419" w:eastAsia="es-CO"/>
-        </w:rPr>
-        <w:t xml:space="preserve"> </w:t>
-      </w:r>
-      <w:proofErr w:type="spellStart"/>
-      <w:r>
-        <w:rPr>
-          <w:rStyle w:val="Extranjerismo"/>
-          <w:lang w:val="es-419" w:eastAsia="es-CO"/>
-        </w:rPr>
-        <w:t>Programming</w:t>
-      </w:r>
-      <w:proofErr w:type="spellEnd"/>
-      <w:r>
-        <w:rPr>
-          <w:rStyle w:val="Extranjerismo"/>
-          <w:lang w:val="es-419" w:eastAsia="es-CO"/>
-        </w:rPr>
-        <w:t xml:space="preserve"> Interfaces </w:t>
-      </w:r>
-      <w:r>
-        <w:rPr>
-          <w:lang w:val="es-419" w:eastAsia="es-CO"/>
-        </w:rPr>
-        <w:t>[API]).</w:t>
-      </w:r>
-    </w:p>
-    <w:p>
-      <w:pPr>
-        <w:rPr>
-          <w:lang w:val="es-419" w:eastAsia="es-CO"/>
-        </w:rPr>
-      </w:pPr>
-      <w:r>
-        <w:rPr>
-          <w:lang w:val="es-419" w:eastAsia="es-CO"/>
-        </w:rPr>
-        <w:t xml:space="preserve">Mediante la ingeniería de </w:t>
-      </w:r>
-      <w:proofErr w:type="spellStart"/>
-      <w:r>
-        <w:rPr>
-          <w:rStyle w:val="Extranjerismo"/>
-          <w:lang w:val="es-419" w:eastAsia="es-CO"/>
-        </w:rPr>
-        <w:t>prompts</w:t>
-      </w:r>
-      <w:proofErr w:type="spellEnd"/>
-      <w:r>
-        <w:rPr>
-          <w:lang w:val="es-419" w:eastAsia="es-CO"/>
-        </w:rPr>
-        <w:t>, es posible diseñar flujos de trabajo destinados a automatizar tareas repetitivas de baja complejidad cognitiva y alto consumo de tiempo operativo. A continuación, se presentan algunos ejemplos de automatización mediante IA:</w:t>
+          <w:rStyle w:val="Ttulo5Car"/>
+        </w:rPr>
+        <w:t>Renombrado masivo de archivos.</w:t>
+      </w:r>
+      <w:r>
+        <w:rPr>
+          <w:lang w:val="es-419" w:eastAsia="es-CO"/>
+        </w:rPr>
+        <w:t xml:space="preserve"> Organización automatizada de documentos según criterios específicos.</w:t>
       </w:r>
     </w:p>
     <w:p>
@@ -12136,13 +12696,28 @@
         <w:rPr>
           <w:rStyle w:val="Ttulo5Car"/>
         </w:rPr>
-        <w:t>Renombrado masivo de archivos.</w:t>
-      </w:r>
-      <w:r>
-        <w:rPr>
-          <w:lang w:val="es-419" w:eastAsia="es-CO"/>
-        </w:rPr>
-        <w:t xml:space="preserve"> Organización automatizada de documentos según criterios específicos.</w:t>
+        <w:t>Generación de pruebas de</w:t>
+      </w:r>
+      <w:r>
+        <w:rPr>
+          <w:lang w:val="es-419" w:eastAsia="es-CO"/>
+        </w:rPr>
+        <w:t xml:space="preserve"> </w:t>
+      </w:r>
+      <w:r>
+        <w:rPr>
+          <w:rStyle w:val="Extranjerismo"/>
+          <w:b/>
+          <w:bCs/>
+          <w:lang w:val="es-419" w:eastAsia="es-CO"/>
+        </w:rPr>
+        <w:t>software</w:t>
+      </w:r>
+      <w:r>
+        <w:rPr>
+          <w:lang w:val="es-419" w:eastAsia="es-CO"/>
+        </w:rPr>
+        <w:t>. Creación automática de casos de prueba y validaciones funcionales.</w:t>
       </w:r>
     </w:p>
     <w:p>
@@ -12161,28 +12736,13 @@
         <w:rPr>
           <w:rStyle w:val="Ttulo5Car"/>
         </w:rPr>
-        <w:t>Generación de pruebas de</w:t>
-      </w:r>
-      <w:r>
-        <w:rPr>
-          <w:lang w:val="es-419" w:eastAsia="es-CO"/>
-        </w:rPr>
-        <w:t xml:space="preserve"> </w:t>
-      </w:r>
-      <w:r>
-        <w:rPr>
-          <w:rStyle w:val="Extranjerismo"/>
-          <w:b/>
-          <w:bCs/>
-          <w:lang w:val="es-419" w:eastAsia="es-CO"/>
-        </w:rPr>
-        <w:t>software</w:t>
-      </w:r>
-      <w:r>
-        <w:rPr>
-          <w:lang w:val="es-419" w:eastAsia="es-CO"/>
-        </w:rPr>
-        <w:t>. Creación automática de casos de prueba y validaciones funcionales.</w:t>
+        <w:t>Estructuración de reportes financieros.</w:t>
+      </w:r>
+      <w:r>
+        <w:rPr>
+          <w:lang w:val="es-419" w:eastAsia="es-CO"/>
+        </w:rPr>
+        <w:t xml:space="preserve"> Generación de informes organizados a partir de datos contables o administrativos.</w:t>
       </w:r>
     </w:p>
     <w:p>
@@ -12201,13 +12761,53 @@
         <w:rPr>
           <w:rStyle w:val="Ttulo5Car"/>
         </w:rPr>
-        <w:t>Estructuración de reportes financieros.</w:t>
-      </w:r>
-      <w:r>
-        <w:rPr>
-          <w:lang w:val="es-419" w:eastAsia="es-CO"/>
-        </w:rPr>
-        <w:t xml:space="preserve"> Generación de informes organizados a partir de datos contables o administrativos.</w:t>
+        <w:t>Automatización documental.</w:t>
+      </w:r>
+      <w:r>
+        <w:rPr>
+          <w:lang w:val="es-419" w:eastAsia="es-CO"/>
+        </w:rPr>
+        <w:t xml:space="preserve"> Clasificación y distribución de archivos mediante reglas predefinidas.</w:t>
+      </w:r>
+    </w:p>
+    <w:p>
+      <w:pPr>
+        <w:rPr>
+          <w:lang w:val="es-419" w:eastAsia="es-CO"/>
+        </w:rPr>
+      </w:pPr>
+      <w:r>
+        <w:rPr>
+          <w:lang w:val="es-419" w:eastAsia="es-CO"/>
+        </w:rPr>
+        <w:t xml:space="preserve">En este contexto, el aprendiz debe desarrollar la capacidad de instruir al modelo para generar </w:t>
+      </w:r>
+      <w:r>
+        <w:rPr>
+          <w:rStyle w:val="Extranjerismo"/>
+          <w:lang w:val="es-419" w:eastAsia="es-CO"/>
+        </w:rPr>
+        <w:t>scripts</w:t>
+      </w:r>
+      <w:r>
+        <w:rPr>
+          <w:lang w:val="es-419" w:eastAsia="es-CO"/>
+        </w:rPr>
+        <w:t xml:space="preserve">, por </w:t>
+      </w:r>
+      <w:proofErr w:type="gramStart"/>
+      <w:r>
+        <w:rPr>
+          <w:lang w:val="es-419" w:eastAsia="es-CO"/>
+        </w:rPr>
+        <w:t>ejemplo</w:t>
+      </w:r>
+      <w:proofErr w:type="gramEnd"/>
+      <w:r>
+        <w:rPr>
+          <w:lang w:val="es-419" w:eastAsia="es-CO"/>
+        </w:rPr>
+        <w:t xml:space="preserve"> en PowerShell o Python, que interactúen con sistemas operativos o servicios externos para optimizar procesos reales de la organización.</w:t>
       </w:r>
     </w:p>
     <w:p>
@@ -12215,55 +12815,9 @@
         <w:pStyle w:val="Prrafodelista"/>
         <w:numPr>
           <w:ilvl w:val="0"/>
-          <w:numId w:val="36"/>
+          <w:numId w:val="25"/>
         </w:numPr>
-        <w:ind w:left="993"/>
-        <w:rPr>
-          <w:lang w:val="es-419" w:eastAsia="es-CO"/>
-        </w:rPr>
-      </w:pPr>
-      <w:r>
-        <w:rPr>
-          <w:rStyle w:val="Ttulo5Car"/>
-        </w:rPr>
-        <w:t>Automatización documental.</w:t>
-      </w:r>
-      <w:r>
-        <w:rPr>
-          <w:lang w:val="es-419" w:eastAsia="es-CO"/>
-        </w:rPr>
-        <w:t xml:space="preserve"> Clasificación y distribución de archivos mediante reglas predefinidas.</w:t>
-      </w:r>
-    </w:p>
-    <w:p>
-      <w:pPr>
-        <w:rPr>
-          <w:lang w:val="es-419" w:eastAsia="es-CO"/>
-        </w:rPr>
-      </w:pPr>
-      <w:r>
-        <w:rPr>
-          <w:lang w:val="es-419" w:eastAsia="es-CO"/>
-        </w:rPr>
-        <w:t xml:space="preserve">En este contexto, el aprendiz debe desarrollar la capacidad de instruir al modelo para generar scripts, por </w:t>
-      </w:r>
-      <w:proofErr w:type="gramStart"/>
-      <w:r>
-        <w:rPr>
-          <w:lang w:val="es-419" w:eastAsia="es-CO"/>
-        </w:rPr>
-        <w:t>ejemplo</w:t>
-      </w:r>
-      <w:proofErr w:type="gramEnd"/>
-      <w:r>
-        <w:rPr>
-          <w:lang w:val="es-419" w:eastAsia="es-CO"/>
-        </w:rPr>
-        <w:t xml:space="preserve"> en PowerShell o Python, que interactúen con sistemas operativos o servicios externos para optimizar procesos reales de la organización.</w:t>
-      </w:r>
-    </w:p>
-    <w:p>
-      <w:pPr>
+        <w:ind w:left="709" w:hanging="425"/>
         <w:rPr>
           <w:lang w:val="es-419" w:eastAsia="es-CO"/>
         </w:rPr>
@@ -12286,6 +12840,12 @@
           <w:lang w:val="es-419" w:eastAsia="es-CO"/>
         </w:rPr>
         <w:t>Para comprender este contexto, se presenta un escenario aplicado asociado a la automatización documental en procesos administrativos</w:t>
+      </w:r>
+      <w:r>
+        <w:rPr>
+          <w:lang w:val="es-419" w:eastAsia="es-CO"/>
+        </w:rPr>
+        <w:t>.</w:t>
       </w:r>
     </w:p>
     <w:p>
@@ -12323,7 +12883,20 @@
         <w:rPr>
           <w:lang w:val="es-419" w:eastAsia="es-CO"/>
         </w:rPr>
-        <w:t>Proceso técnico: se suministra una plantilla técnica a la IA junto con una muestra de datos. Posteriormente, se instruye al modelo para generar un script automatizado que lea los metadatos de los archivos y ejecute el movimiento jerarquizado dentro del servidor local.</w:t>
+        <w:t xml:space="preserve">Proceso técnico: se suministra una plantilla técnica a la IA junto con una muestra de datos. Posteriormente, se instruye al modelo para generar un </w:t>
+      </w:r>
+      <w:r>
+        <w:rPr>
+          <w:rStyle w:val="Extranjerismo"/>
+          <w:lang w:val="es-419" w:eastAsia="es-CO"/>
+        </w:rPr>
+        <w:t>script</w:t>
+      </w:r>
+      <w:r>
+        <w:rPr>
+          <w:lang w:val="es-419" w:eastAsia="es-CO"/>
+        </w:rPr>
+        <w:t xml:space="preserve"> automatizado que lea los metadatos de los archivos y ejecute el movimiento jerarquizado dentro del servidor local.</w:t>
       </w:r>
     </w:p>
     <w:p>
@@ -12426,10 +12999,10 @@
           <w:lang w:eastAsia="es-CO"/>
         </w:rPr>
         <w:drawing>
-          <wp:inline distT="0" distB="0" distL="0" distR="0" wp14:anchorId="36432D9A" wp14:editId="737F8F4F">
-            <wp:extent cx="6332220" cy="6132195"/>
-            <wp:effectExtent l="0" t="0" r="0" b="1905"/>
-            <wp:docPr id="12" name="Gráfico 12" descr="Síntesis sobre inteligencia artificial generativa que integra fundamentos y evolución de la IA, arquitectura de modelos LLM y RAG, infraestructura IaaS y SaaS, clasificación de plataformas de IAG, gobernanza y normatividad en Colombia, componentes de ingeniería de prompts, técnicas de prompting, rails de control, optimización de instrucciones y automatización de flujos de trabajo en entornos productivos. "/>
+          <wp:inline distT="0" distB="0" distL="0" distR="0" wp14:anchorId="502FE206" wp14:editId="418E2B63">
+            <wp:extent cx="5840229" cy="5760720"/>
+            <wp:effectExtent l="0" t="0" r="8255" b="0"/>
+            <wp:docPr id="856274549" name="Imagen 1" descr="Síntesis sobre inteligencia artificial generativa que integra fundamentos y evolución de la IA, arquitectura de modelos LLM y RAG, infraestructura IaaS y SaaS, clasificación de plataformas de IAG, gobernanza y normatividad en Colombia, componentes de ingeniería de prompts, técnicas de prompting, rails de control, optimización de instrucciones y automatización de flujos de trabajo en entornos productivos. "/>
             <wp:cNvGraphicFramePr>
               <a:graphicFrameLocks xmlns:a="http://schemas.openxmlformats.org/drawingml/2006/main" noChangeAspect="1"/>
             </wp:cNvGraphicFramePr>
@@ -12437,20 +13010,11 @@
               <a:graphicData uri="http://schemas.openxmlformats.org/drawingml/2006/picture">
                 <pic:pic xmlns:pic="http://schemas.openxmlformats.org/drawingml/2006/picture">
                   <pic:nvPicPr>
-                    <pic:cNvPr id="12" name="Gráfico 12" descr="Síntesis sobre inteligencia artificial generativa que integra fundamentos y evolución de la IA, arquitectura de modelos LLM y RAG, infraestructura IaaS y SaaS, clasificación de plataformas de IAG, gobernanza y normatividad en Colombia, componentes de ingeniería de prompts, técnicas de prompting, rails de control, optimización de instrucciones y automatización de flujos de trabajo en entornos productivos. "/>
+                    <pic:cNvPr id="856274549" name="Imagen 1" descr="Síntesis sobre inteligencia artificial generativa que integra fundamentos y evolución de la IA, arquitectura de modelos LLM y RAG, infraestructura IaaS y SaaS, clasificación de plataformas de IAG, gobernanza y normatividad en Colombia, componentes de ingeniería de prompts, técnicas de prompting, rails de control, optimización de instrucciones y automatización de flujos de trabajo en entornos productivos. "/>
                     <pic:cNvPicPr/>
                   </pic:nvPicPr>
                   <pic:blipFill>
-                    <a:blip r:embed="rId19">
-                      <a:extLst>
-                        <a:ext uri="{28A0092B-C50C-407E-A947-70E740481C1C}">
-                          <a14:useLocalDpi xmlns:a14="http://schemas.microsoft.com/office/drawing/2010/main" val="0"/>
-                        </a:ext>
-                        <a:ext uri="{96DAC541-7B7A-43D3-8B79-37D633B846F1}">
-                          <asvg:svgBlip xmlns:asvg="http://schemas.microsoft.com/office/drawing/2016/SVG/main" r:embed="rId20"/>
-                        </a:ext>
-                      </a:extLst>
-                    </a:blip>
+                    <a:blip r:embed="rId18"/>
                     <a:stretch>
                       <a:fillRect/>
                     </a:stretch>
@@ -12458,7 +13022,7 @@
                   <pic:spPr>
                     <a:xfrm>
                       <a:off x="0" y="0"/>
-                      <a:ext cx="6332220" cy="6132195"/>
+                      <a:ext cx="5844391" cy="5764825"/>
                     </a:xfrm>
                     <a:prstGeom prst="rect">
                       <a:avLst/>
@@ -12521,13 +13085,14 @@
       <w:r>
         <w:t xml:space="preserve"> sistemas de almacenamiento que organizan información mediante representaciones numéricas llamadas </w:t>
       </w:r>
-      <w:proofErr w:type="spellStart"/>
-      <w:r>
-        <w:t>embeddings</w:t>
-      </w:r>
-      <w:proofErr w:type="spellEnd"/>
-      <w:r>
-        <w:t xml:space="preserve"> para búsqueda semántica.</w:t>
+      <w:r>
+        <w:rPr>
+          <w:rStyle w:val="Extranjerismo"/>
+        </w:rPr>
+        <w:t xml:space="preserve">embeddings </w:t>
+      </w:r>
+      <w:r>
+        <w:t>para búsqueda semántica.</w:t>
       </w:r>
     </w:p>
     <w:p>
@@ -12719,23 +13284,16 @@
       <w:r>
         <w:t xml:space="preserve">academia-ia.com. (2024). Introducción a </w:t>
       </w:r>
-      <w:proofErr w:type="spellStart"/>
-      <w:r>
-        <w:t>prompt</w:t>
-      </w:r>
-      <w:proofErr w:type="spellEnd"/>
-      <w:r>
-        <w:t xml:space="preserve"> </w:t>
-      </w:r>
-      <w:proofErr w:type="spellStart"/>
-      <w:r>
-        <w:t>engineering</w:t>
-      </w:r>
-      <w:proofErr w:type="spellEnd"/>
+      <w:r>
+        <w:rPr>
+          <w:rStyle w:val="Extranjerismo"/>
+        </w:rPr>
+        <w:t>prompt engineering</w:t>
+      </w:r>
       <w:r>
         <w:t xml:space="preserve">. El club de la IA. </w:t>
       </w:r>
-      <w:hyperlink r:id="rId21" w:history="1">
+      <w:hyperlink r:id="rId19" w:history="1">
         <w:r>
           <w:rPr>
             <w:rStyle w:val="Hipervnculo"/>
@@ -12763,7 +13321,7 @@
       </w:r>
     </w:p>
     <w:p>
-      <w:hyperlink r:id="rId22" w:history="1">
+      <w:hyperlink r:id="rId20" w:history="1">
         <w:r>
           <w:rPr>
             <w:rStyle w:val="Hipervnculo"/>
@@ -12776,7 +13334,7 @@
       <w:r>
         <w:t xml:space="preserve">Departamento Nacional de Planeación, República de Colombia. (2025). Documento CONPES 4144: Política nacional de inteligencia artificial. </w:t>
       </w:r>
-      <w:hyperlink r:id="rId23" w:history="1">
+      <w:hyperlink r:id="rId21" w:history="1">
         <w:r>
           <w:rPr>
             <w:rStyle w:val="Hipervnculo"/>
@@ -12794,7 +13352,7 @@
       <w:r>
         <w:t xml:space="preserve"> </w:t>
       </w:r>
-      <w:hyperlink r:id="rId24" w:history="1">
+      <w:hyperlink r:id="rId22" w:history="1">
         <w:r>
           <w:rPr>
             <w:rStyle w:val="Hipervnculo"/>
@@ -12807,36 +13365,38 @@
       <w:r>
         <w:t xml:space="preserve">Jara Rey, A. (2024). Legal </w:t>
       </w:r>
+      <w:r>
+        <w:rPr>
+          <w:rStyle w:val="Extranjerismo"/>
+        </w:rPr>
+        <w:t>prompts</w:t>
+      </w:r>
+      <w:r>
+        <w:t>: guía práctica de instrucciones para uso de IA generativa. ISBN 978-987-03-4830-6.</w:t>
+      </w:r>
+    </w:p>
+    <w:p>
+      <w:r>
+        <w:t xml:space="preserve">Méndez Solano, A., Durán Campos, J., &amp; Quirós Artiñano, D. (2024). Ingeniería de </w:t>
+      </w:r>
+      <w:r>
+        <w:rPr>
+          <w:rStyle w:val="Extranjerismo"/>
+        </w:rPr>
+        <w:t>prompts</w:t>
+      </w:r>
+      <w:r>
+        <w:t xml:space="preserve">. </w:t>
+      </w:r>
       <w:proofErr w:type="spellStart"/>
       <w:r>
-        <w:t>prompts</w:t>
+        <w:t>Zenodo</w:t>
       </w:r>
       <w:proofErr w:type="spellEnd"/>
       <w:r>
-        <w:t>: guía práctica de instrucciones para uso de IA generativa. ISBN 978-987-03-4830-6.</w:t>
-      </w:r>
-    </w:p>
-    <w:p>
-      <w:r>
-        <w:t xml:space="preserve">Méndez Solano, A., Durán Campos, J., &amp; Quirós Artiñano, D. (2024). Ingeniería de </w:t>
-      </w:r>
-      <w:proofErr w:type="spellStart"/>
-      <w:r>
-        <w:t>prompts</w:t>
-      </w:r>
-      <w:proofErr w:type="spellEnd"/>
-      <w:r>
         <w:t xml:space="preserve">. </w:t>
       </w:r>
-      <w:proofErr w:type="spellStart"/>
-      <w:r>
-        <w:t>Zenodo</w:t>
-      </w:r>
-      <w:proofErr w:type="spellEnd"/>
-      <w:r>
-        <w:t xml:space="preserve">. </w:t>
-      </w:r>
-      <w:hyperlink r:id="rId25" w:history="1">
+      <w:hyperlink r:id="rId23" w:history="1">
         <w:r>
           <w:rPr>
             <w:rStyle w:val="Hipervnculo"/>
@@ -12849,7 +13409,7 @@
       <w:r>
         <w:t xml:space="preserve">Ministerio de Ciencia, Innovación y Universidades, España. (2019). Estrategia española de I+D+I en inteligencia artificial. </w:t>
       </w:r>
-      <w:hyperlink r:id="rId26" w:history="1">
+      <w:hyperlink r:id="rId24" w:history="1">
         <w:r>
           <w:rPr>
             <w:rStyle w:val="Hipervnculo"/>
@@ -12884,7 +13444,7 @@
       <w:r>
         <w:t xml:space="preserve">. </w:t>
       </w:r>
-      <w:hyperlink r:id="rId27" w:history="1">
+      <w:hyperlink r:id="rId25" w:history="1">
         <w:r>
           <w:rPr>
             <w:rStyle w:val="Hipervnculo"/>
@@ -12897,7 +13457,7 @@
       <w:r>
         <w:t xml:space="preserve">República de Colombia. (2012). Ley Estatutaria 1581 de 2012. </w:t>
       </w:r>
-      <w:hyperlink r:id="rId28" w:history="1">
+      <w:hyperlink r:id="rId26" w:history="1">
         <w:r>
           <w:rPr>
             <w:rStyle w:val="Hipervnculo"/>
@@ -13002,7 +13562,7 @@
               <w:ind w:firstLine="0"/>
               <w:rPr>
                 <w:rFonts w:asciiTheme="minorHAnsi" w:hAnsiTheme="minorHAnsi"/>
-                <w:b w:val="0"/>
+                <w:bCs/>
                 <w:kern w:val="2"/>
                 <w:lang w:eastAsia="es-CO"/>
                 <w14:ligatures w14:val="standardContextual"/>
@@ -13011,7 +13571,7 @@
             <w:r>
               <w:rPr>
                 <w:rFonts w:asciiTheme="minorHAnsi" w:hAnsiTheme="minorHAnsi"/>
-                <w:b w:val="0"/>
+                <w:bCs/>
                 <w:kern w:val="2"/>
                 <w:lang w:eastAsia="es-CO"/>
                 <w14:ligatures w14:val="standardContextual"/>
@@ -13036,7 +13596,7 @@
               <w:ind w:firstLine="0"/>
               <w:rPr>
                 <w:rFonts w:asciiTheme="minorHAnsi" w:hAnsiTheme="minorHAnsi"/>
-                <w:b w:val="0"/>
+                <w:bCs/>
                 <w:kern w:val="2"/>
                 <w:lang w:eastAsia="es-CO"/>
                 <w14:ligatures w14:val="standardContextual"/>
@@ -13045,7 +13605,7 @@
             <w:r>
               <w:rPr>
                 <w:rFonts w:asciiTheme="minorHAnsi" w:hAnsiTheme="minorHAnsi"/>
-                <w:b w:val="0"/>
+                <w:bCs/>
                 <w:kern w:val="2"/>
                 <w:lang w:eastAsia="es-CO"/>
                 <w14:ligatures w14:val="standardContextual"/>
@@ -13070,7 +13630,7 @@
               <w:ind w:firstLine="0"/>
               <w:rPr>
                 <w:rFonts w:asciiTheme="minorHAnsi" w:hAnsiTheme="minorHAnsi"/>
-                <w:b w:val="0"/>
+                <w:bCs/>
                 <w:kern w:val="2"/>
                 <w:lang w:eastAsia="es-CO"/>
                 <w14:ligatures w14:val="standardContextual"/>
@@ -13079,7 +13639,7 @@
             <w:r>
               <w:rPr>
                 <w:rFonts w:asciiTheme="minorHAnsi" w:hAnsiTheme="minorHAnsi"/>
-                <w:b w:val="0"/>
+                <w:bCs/>
                 <w:kern w:val="2"/>
                 <w:lang w:eastAsia="es-CO"/>
                 <w14:ligatures w14:val="standardContextual"/>
@@ -13234,17 +13794,8 @@
                 <w:sz w:val="24"/>
                 <w:lang w:eastAsia="es-CO"/>
               </w:rPr>
-              <w:t xml:space="preserve">Olga Constanza Bermúdez </w:t>
-            </w:r>
-            <w:proofErr w:type="spellStart"/>
-            <w:r>
-              <w:rPr>
-                <w:sz w:val="24"/>
-                <w:lang w:eastAsia="es-CO"/>
-              </w:rPr>
-              <w:t>Jaimes</w:t>
-            </w:r>
-            <w:proofErr w:type="spellEnd"/>
+              <w:t>Olga Constanza Bermúdez Jaimes</w:t>
+            </w:r>
           </w:p>
         </w:tc>
         <w:tc>
@@ -13507,39 +14058,7 @@
                 <w:sz w:val="24"/>
                 <w:lang w:eastAsia="es-CO"/>
               </w:rPr>
-              <w:t xml:space="preserve">Carlos </w:t>
-            </w:r>
-            <w:proofErr w:type="spellStart"/>
-            <w:r>
-              <w:rPr>
-                <w:sz w:val="24"/>
-                <w:lang w:eastAsia="es-CO"/>
-              </w:rPr>
-              <w:t>Julian</w:t>
-            </w:r>
-            <w:proofErr w:type="spellEnd"/>
-            <w:r>
-              <w:rPr>
-                <w:sz w:val="24"/>
-                <w:lang w:eastAsia="es-CO"/>
-              </w:rPr>
-              <w:t xml:space="preserve"> </w:t>
-            </w:r>
-            <w:proofErr w:type="spellStart"/>
-            <w:r>
-              <w:rPr>
-                <w:sz w:val="24"/>
-                <w:lang w:eastAsia="es-CO"/>
-              </w:rPr>
-              <w:t>Ramirez</w:t>
-            </w:r>
-            <w:proofErr w:type="spellEnd"/>
-            <w:r>
-              <w:rPr>
-                <w:sz w:val="24"/>
-                <w:lang w:eastAsia="es-CO"/>
-              </w:rPr>
-              <w:t xml:space="preserve"> Benitez</w:t>
+              <w:t>Carlos Julian Ramirez Benitez</w:t>
             </w:r>
           </w:p>
         </w:tc>
@@ -14083,31 +14602,13 @@
                 <w:lang w:eastAsia="es-CO"/>
               </w:rPr>
             </w:pPr>
-            <w:proofErr w:type="spellStart"/>
             <w:r>
               <w:rPr>
                 <w:sz w:val="24"/>
                 <w:lang w:eastAsia="es-CO"/>
               </w:rPr>
-              <w:t>Maria</w:t>
-            </w:r>
-            <w:proofErr w:type="spellEnd"/>
-            <w:r>
-              <w:rPr>
-                <w:sz w:val="24"/>
-                <w:lang w:eastAsia="es-CO"/>
-              </w:rPr>
-              <w:t xml:space="preserve"> Carolina Tamayo </w:t>
-            </w:r>
-            <w:proofErr w:type="spellStart"/>
-            <w:r>
-              <w:rPr>
-                <w:sz w:val="24"/>
-                <w:lang w:eastAsia="es-CO"/>
-              </w:rPr>
-              <w:t>Lopez</w:t>
-            </w:r>
-            <w:proofErr w:type="spellEnd"/>
+              <w:t>Maria Carolina Tamayo Lopez</w:t>
+            </w:r>
           </w:p>
         </w:tc>
         <w:tc>
@@ -14623,8 +15124,8 @@
     </w:p>
     <w:p/>
     <w:sectPr>
-      <w:headerReference w:type="default" r:id="rId29"/>
-      <w:footerReference w:type="default" r:id="rId30"/>
+      <w:headerReference w:type="default" r:id="rId27"/>
+      <w:footerReference w:type="default" r:id="rId28"/>
       <w:pgSz w:w="12240" w:h="15840"/>
       <w:pgMar w:top="1701" w:right="1134" w:bottom="1134" w:left="1134" w:header="709" w:footer="737" w:gutter="0"/>
       <w:pgNumType w:start="1"/>
@@ -14856,7 +15357,7 @@
         <w:rFonts w:ascii="Symbol" w:hAnsi="Symbol" w:hint="default"/>
       </w:rPr>
     </w:lvl>
-    <w:lvl w:ilvl="1" w:tplc="04090003" w:tentative="1">
+    <w:lvl w:ilvl="1" w:tplc="04090003">
       <w:start w:val="1"/>
       <w:numFmt w:val="bullet"/>
       <w:lvlText w:val="o"/>
@@ -14969,7 +15470,7 @@
         <w:rFonts w:ascii="Symbol" w:hAnsi="Symbol" w:hint="default"/>
       </w:rPr>
     </w:lvl>
-    <w:lvl w:ilvl="1" w:tplc="04090003" w:tentative="1">
+    <w:lvl w:ilvl="1" w:tplc="04090003">
       <w:start w:val="1"/>
       <w:numFmt w:val="bullet"/>
       <w:lvlText w:val="o"/>
@@ -15295,7 +15796,7 @@
   <w:abstractNum w:abstractNumId="5" w15:restartNumberingAfterBreak="0">
     <w:nsid w:val="1003005F"/>
     <w:multiLevelType w:val="hybridMultilevel"/>
-    <w:tmpl w:val="DEBEB686"/>
+    <w:tmpl w:val="907C6ABA"/>
     <w:lvl w:ilvl="0" w:tplc="240A0001">
       <w:start w:val="1"/>
       <w:numFmt w:val="bullet"/>
@@ -15647,7 +16148,7 @@
         <w:rFonts w:ascii="Symbol" w:hAnsi="Symbol" w:hint="default"/>
       </w:rPr>
     </w:lvl>
-    <w:lvl w:ilvl="1" w:tplc="04090003" w:tentative="1">
+    <w:lvl w:ilvl="1" w:tplc="04090003">
       <w:start w:val="1"/>
       <w:numFmt w:val="bullet"/>
       <w:lvlText w:val="o"/>
@@ -15964,7 +16465,7 @@
         <w:rFonts w:ascii="Symbol" w:hAnsi="Symbol" w:hint="default"/>
       </w:rPr>
     </w:lvl>
-    <w:lvl w:ilvl="1" w:tplc="04090003" w:tentative="1">
+    <w:lvl w:ilvl="1" w:tplc="04090003">
       <w:start w:val="1"/>
       <w:numFmt w:val="bullet"/>
       <w:lvlText w:val="o"/>
@@ -16077,7 +16578,7 @@
         <w:rFonts w:ascii="Symbol" w:hAnsi="Symbol" w:hint="default"/>
       </w:rPr>
     </w:lvl>
-    <w:lvl w:ilvl="1" w:tplc="04090003" w:tentative="1">
+    <w:lvl w:ilvl="1" w:tplc="04090003">
       <w:start w:val="1"/>
       <w:numFmt w:val="bullet"/>
       <w:lvlText w:val="o"/>
@@ -16497,28 +16998,32 @@
   <w:abstractNum w:abstractNumId="16" w15:restartNumberingAfterBreak="0">
     <w:nsid w:val="37C1184A"/>
     <w:multiLevelType w:val="hybridMultilevel"/>
-    <w:tmpl w:val="625CCEE6"/>
+    <w:tmpl w:val="AB80D9EA"/>
     <w:lvl w:ilvl="0" w:tplc="DBB41558">
       <w:start w:val="1"/>
       <w:numFmt w:val="upperLetter"/>
       <w:lvlText w:val="%1."/>
       <w:lvlJc w:val="left"/>
       <w:pPr>
-        <w:ind w:left="1429" w:hanging="360"/>
+        <w:ind w:left="1546" w:hanging="360"/>
       </w:pPr>
       <w:rPr>
         <w:b/>
         <w:bCs/>
       </w:rPr>
     </w:lvl>
-    <w:lvl w:ilvl="1" w:tplc="04090019" w:tentative="1">
+    <w:lvl w:ilvl="1" w:tplc="5F800840">
       <w:start w:val="1"/>
       <w:numFmt w:val="lowerLetter"/>
       <w:lvlText w:val="%2."/>
       <w:lvlJc w:val="left"/>
       <w:pPr>
-        <w:ind w:left="2149" w:hanging="360"/>
-      </w:pPr>
+        <w:ind w:left="2266" w:hanging="360"/>
+      </w:pPr>
+      <w:rPr>
+        <w:b/>
+        <w:bCs/>
+      </w:rPr>
     </w:lvl>
     <w:lvl w:ilvl="2" w:tplc="0409001B" w:tentative="1">
       <w:start w:val="1"/>
@@ -16526,7 +17031,7 @@
       <w:lvlText w:val="%3."/>
       <w:lvlJc w:val="right"/>
       <w:pPr>
-        <w:ind w:left="2869" w:hanging="180"/>
+        <w:ind w:left="2986" w:hanging="180"/>
       </w:pPr>
     </w:lvl>
     <w:lvl w:ilvl="3" w:tplc="0409000F" w:tentative="1">
@@ -16535,7 +17040,7 @@
       <w:lvlText w:val="%4."/>
       <w:lvlJc w:val="left"/>
       <w:pPr>
-        <w:ind w:left="3589" w:hanging="360"/>
+        <w:ind w:left="3706" w:hanging="360"/>
       </w:pPr>
     </w:lvl>
     <w:lvl w:ilvl="4" w:tplc="04090019" w:tentative="1">
@@ -16544,7 +17049,7 @@
       <w:lvlText w:val="%5."/>
       <w:lvlJc w:val="left"/>
       <w:pPr>
-        <w:ind w:left="4309" w:hanging="360"/>
+        <w:ind w:left="4426" w:hanging="360"/>
       </w:pPr>
     </w:lvl>
     <w:lvl w:ilvl="5" w:tplc="0409001B" w:tentative="1">
@@ -16553,7 +17058,7 @@
       <w:lvlText w:val="%6."/>
       <w:lvlJc w:val="right"/>
       <w:pPr>
-        <w:ind w:left="5029" w:hanging="180"/>
+        <w:ind w:left="5146" w:hanging="180"/>
       </w:pPr>
     </w:lvl>
     <w:lvl w:ilvl="6" w:tplc="0409000F" w:tentative="1">
@@ -16562,7 +17067,7 @@
       <w:lvlText w:val="%7."/>
       <w:lvlJc w:val="left"/>
       <w:pPr>
-        <w:ind w:left="5749" w:hanging="360"/>
+        <w:ind w:left="5866" w:hanging="360"/>
       </w:pPr>
     </w:lvl>
     <w:lvl w:ilvl="7" w:tplc="04090019" w:tentative="1">
@@ -16571,7 +17076,7 @@
       <w:lvlText w:val="%8."/>
       <w:lvlJc w:val="left"/>
       <w:pPr>
-        <w:ind w:left="6469" w:hanging="360"/>
+        <w:ind w:left="6586" w:hanging="360"/>
       </w:pPr>
     </w:lvl>
     <w:lvl w:ilvl="8" w:tplc="0409001B" w:tentative="1">
@@ -16580,7 +17085,7 @@
       <w:lvlText w:val="%9."/>
       <w:lvlJc w:val="right"/>
       <w:pPr>
-        <w:ind w:left="7189" w:hanging="180"/>
+        <w:ind w:left="7306" w:hanging="180"/>
       </w:pPr>
     </w:lvl>
   </w:abstractNum>
@@ -17896,7 +18401,7 @@
         <w:rFonts w:ascii="Symbol" w:hAnsi="Symbol" w:hint="default"/>
       </w:rPr>
     </w:lvl>
-    <w:lvl w:ilvl="1" w:tplc="04090003" w:tentative="1">
+    <w:lvl w:ilvl="1" w:tplc="04090003">
       <w:start w:val="1"/>
       <w:numFmt w:val="bullet"/>
       <w:lvlText w:val="o"/>
@@ -18348,7 +18853,7 @@
         <w:rFonts w:ascii="Symbol" w:hAnsi="Symbol" w:hint="default"/>
       </w:rPr>
     </w:lvl>
-    <w:lvl w:ilvl="1" w:tplc="04090003" w:tentative="1">
+    <w:lvl w:ilvl="1" w:tplc="04090003">
       <w:start w:val="1"/>
       <w:numFmt w:val="bullet"/>
       <w:lvlText w:val="o"/>
@@ -18461,7 +18966,7 @@
         <w:rFonts w:ascii="Symbol" w:hAnsi="Symbol" w:hint="default"/>
       </w:rPr>
     </w:lvl>
-    <w:lvl w:ilvl="1" w:tplc="04090003" w:tentative="1">
+    <w:lvl w:ilvl="1" w:tplc="04090003">
       <w:start w:val="1"/>
       <w:numFmt w:val="bullet"/>
       <w:lvlText w:val="o"/>
@@ -18574,7 +19079,7 @@
         <w:rFonts w:ascii="Symbol" w:hAnsi="Symbol" w:hint="default"/>
       </w:rPr>
     </w:lvl>
-    <w:lvl w:ilvl="1" w:tplc="04090003" w:tentative="1">
+    <w:lvl w:ilvl="1" w:tplc="04090003">
       <w:start w:val="1"/>
       <w:numFmt w:val="bullet"/>
       <w:lvlText w:val="o"/>
@@ -18784,115 +19289,115 @@
       </w:rPr>
     </w:lvl>
   </w:abstractNum>
-  <w:num w:numId="1" w16cid:durableId="867255480">
+  <w:num w:numId="1" w16cid:durableId="1435784149">
     <w:abstractNumId w:val="0"/>
   </w:num>
-  <w:num w:numId="2" w16cid:durableId="1974945116">
+  <w:num w:numId="2" w16cid:durableId="626816337">
     <w:abstractNumId w:val="10"/>
   </w:num>
-  <w:num w:numId="3" w16cid:durableId="825558331">
+  <w:num w:numId="3" w16cid:durableId="1222012059">
     <w:abstractNumId w:val="24"/>
   </w:num>
-  <w:num w:numId="4" w16cid:durableId="1865170725">
+  <w:num w:numId="4" w16cid:durableId="708265646">
     <w:abstractNumId w:val="15"/>
   </w:num>
-  <w:num w:numId="5" w16cid:durableId="1191576705">
+  <w:num w:numId="5" w16cid:durableId="1227687585">
     <w:abstractNumId w:val="19"/>
   </w:num>
-  <w:num w:numId="6" w16cid:durableId="1348404771">
+  <w:num w:numId="6" w16cid:durableId="1997759637">
     <w:abstractNumId w:val="4"/>
   </w:num>
-  <w:num w:numId="7" w16cid:durableId="1020080669">
+  <w:num w:numId="7" w16cid:durableId="2008557762">
     <w:abstractNumId w:val="32"/>
   </w:num>
-  <w:num w:numId="8" w16cid:durableId="1343436149">
+  <w:num w:numId="8" w16cid:durableId="846554048">
     <w:abstractNumId w:val="18"/>
   </w:num>
-  <w:num w:numId="9" w16cid:durableId="1151214549">
+  <w:num w:numId="9" w16cid:durableId="536282228">
     <w:abstractNumId w:val="20"/>
   </w:num>
-  <w:num w:numId="10" w16cid:durableId="550381965">
+  <w:num w:numId="10" w16cid:durableId="733354576">
     <w:abstractNumId w:val="28"/>
   </w:num>
-  <w:num w:numId="11" w16cid:durableId="723720329">
+  <w:num w:numId="11" w16cid:durableId="1649506254">
     <w:abstractNumId w:val="1"/>
   </w:num>
-  <w:num w:numId="12" w16cid:durableId="584338430">
+  <w:num w:numId="12" w16cid:durableId="1573276975">
     <w:abstractNumId w:val="11"/>
   </w:num>
-  <w:num w:numId="13" w16cid:durableId="1059130837">
+  <w:num w:numId="13" w16cid:durableId="527136132">
     <w:abstractNumId w:val="6"/>
   </w:num>
-  <w:num w:numId="14" w16cid:durableId="1666594672">
+  <w:num w:numId="14" w16cid:durableId="65693389">
     <w:abstractNumId w:val="34"/>
   </w:num>
-  <w:num w:numId="15" w16cid:durableId="1287391263">
+  <w:num w:numId="15" w16cid:durableId="1715227740">
     <w:abstractNumId w:val="31"/>
   </w:num>
-  <w:num w:numId="16" w16cid:durableId="1609508768">
+  <w:num w:numId="16" w16cid:durableId="189614737">
     <w:abstractNumId w:val="35"/>
   </w:num>
-  <w:num w:numId="17" w16cid:durableId="120273934">
+  <w:num w:numId="17" w16cid:durableId="659624848">
     <w:abstractNumId w:val="13"/>
   </w:num>
-  <w:num w:numId="18" w16cid:durableId="1144274183">
+  <w:num w:numId="18" w16cid:durableId="214510716">
     <w:abstractNumId w:val="9"/>
   </w:num>
-  <w:num w:numId="19" w16cid:durableId="102458365">
+  <w:num w:numId="19" w16cid:durableId="463885770">
     <w:abstractNumId w:val="27"/>
   </w:num>
-  <w:num w:numId="20" w16cid:durableId="914128710">
+  <w:num w:numId="20" w16cid:durableId="1011034429">
     <w:abstractNumId w:val="7"/>
   </w:num>
-  <w:num w:numId="21" w16cid:durableId="1144544794">
+  <w:num w:numId="21" w16cid:durableId="539249245">
     <w:abstractNumId w:val="23"/>
   </w:num>
-  <w:num w:numId="22" w16cid:durableId="1952126777">
+  <w:num w:numId="22" w16cid:durableId="712388380">
     <w:abstractNumId w:val="21"/>
   </w:num>
-  <w:num w:numId="23" w16cid:durableId="1231579428">
+  <w:num w:numId="23" w16cid:durableId="597754634">
     <w:abstractNumId w:val="26"/>
   </w:num>
-  <w:num w:numId="24" w16cid:durableId="1359698675">
+  <w:num w:numId="24" w16cid:durableId="1152914436">
     <w:abstractNumId w:val="25"/>
   </w:num>
-  <w:num w:numId="25" w16cid:durableId="562183869">
+  <w:num w:numId="25" w16cid:durableId="123086184">
     <w:abstractNumId w:val="5"/>
   </w:num>
-  <w:num w:numId="26" w16cid:durableId="1200628531">
+  <w:num w:numId="26" w16cid:durableId="892695191">
     <w:abstractNumId w:val="36"/>
   </w:num>
-  <w:num w:numId="27" w16cid:durableId="1594164866">
+  <w:num w:numId="27" w16cid:durableId="100301508">
     <w:abstractNumId w:val="30"/>
   </w:num>
-  <w:num w:numId="28" w16cid:durableId="1454863789">
+  <w:num w:numId="28" w16cid:durableId="98918598">
     <w:abstractNumId w:val="22"/>
   </w:num>
-  <w:num w:numId="29" w16cid:durableId="1206478983">
+  <w:num w:numId="29" w16cid:durableId="384645706">
     <w:abstractNumId w:val="12"/>
   </w:num>
-  <w:num w:numId="30" w16cid:durableId="579218376">
+  <w:num w:numId="30" w16cid:durableId="1984236376">
     <w:abstractNumId w:val="16"/>
   </w:num>
-  <w:num w:numId="31" w16cid:durableId="845050140">
+  <w:num w:numId="31" w16cid:durableId="180509244">
     <w:abstractNumId w:val="29"/>
   </w:num>
-  <w:num w:numId="32" w16cid:durableId="1938907810">
+  <w:num w:numId="32" w16cid:durableId="1874223035">
     <w:abstractNumId w:val="3"/>
   </w:num>
-  <w:num w:numId="33" w16cid:durableId="1791167242">
+  <w:num w:numId="33" w16cid:durableId="86775176">
     <w:abstractNumId w:val="33"/>
   </w:num>
-  <w:num w:numId="34" w16cid:durableId="1851412957">
+  <w:num w:numId="34" w16cid:durableId="1501042046">
     <w:abstractNumId w:val="2"/>
   </w:num>
-  <w:num w:numId="35" w16cid:durableId="100075702">
+  <w:num w:numId="35" w16cid:durableId="722368801">
     <w:abstractNumId w:val="14"/>
   </w:num>
-  <w:num w:numId="36" w16cid:durableId="1697270436">
+  <w:num w:numId="36" w16cid:durableId="720592950">
     <w:abstractNumId w:val="8"/>
   </w:num>
-  <w:num w:numId="37" w16cid:durableId="392504256">
+  <w:num w:numId="37" w16cid:durableId="951128739">
     <w:abstractNumId w:val="17"/>
   </w:num>
   <w:numIdMacAtCleanup w:val="37"/>
@@ -20923,14 +21428,7 @@
 </file>
 
 <file path=customXml/item2.xml><?xml version="1.0" encoding="utf-8"?>
-<p:properties xmlns:p="http://schemas.microsoft.com/office/2006/metadata/properties" xmlns:xsi="http://www.w3.org/2001/XMLSchema-instance" xmlns:pc="http://schemas.microsoft.com/office/infopath/2007/PartnerControls">
-  <documentManagement>
-    <TaxCatchAll xmlns="13c90a0b-73bc-4dc0-be5f-28d77b615beb" xsi:nil="true"/>
-    <lcf76f155ced4ddcb4097134ff3c332f xmlns="13c93bba-48ce-428c-bfe5-88b42c19b028">
-      <Terms xmlns="http://schemas.microsoft.com/office/infopath/2007/PartnerControls"/>
-    </lcf76f155ced4ddcb4097134ff3c332f>
-  </documentManagement>
-</p:properties>
+<b:Sources xmlns:b="http://schemas.openxmlformats.org/officeDocument/2006/bibliography" xmlns="http://schemas.openxmlformats.org/officeDocument/2006/bibliography" SelectedStyle="\APASixthEditionOfficeOnline.xsl" StyleName="APA" Version="6"/>
 </file>
 
 <file path=customXml/item3.xml><?xml version="1.0" encoding="utf-8"?>
@@ -20943,7 +21441,14 @@
 </file>
 
 <file path=customXml/item4.xml><?xml version="1.0" encoding="utf-8"?>
-<b:Sources xmlns:b="http://schemas.openxmlformats.org/officeDocument/2006/bibliography" xmlns="http://schemas.openxmlformats.org/officeDocument/2006/bibliography" SelectedStyle="\APASixthEditionOfficeOnline.xsl" StyleName="APA" Version="6"/>
+<p:properties xmlns:p="http://schemas.microsoft.com/office/2006/metadata/properties" xmlns:xsi="http://www.w3.org/2001/XMLSchema-instance" xmlns:pc="http://schemas.microsoft.com/office/infopath/2007/PartnerControls">
+  <documentManagement>
+    <TaxCatchAll xmlns="13c90a0b-73bc-4dc0-be5f-28d77b615beb" xsi:nil="true"/>
+    <lcf76f155ced4ddcb4097134ff3c332f xmlns="13c93bba-48ce-428c-bfe5-88b42c19b028">
+      <Terms xmlns="http://schemas.microsoft.com/office/infopath/2007/PartnerControls"/>
+    </lcf76f155ced4ddcb4097134ff3c332f>
+  </documentManagement>
+</p:properties>
 </file>
 
 <file path=customXml/itemProps1.xml><?xml version="1.0" encoding="utf-8"?>
@@ -20966,12 +21471,9 @@
 </file>
 
 <file path=customXml/itemProps2.xml><?xml version="1.0" encoding="utf-8"?>
-<ds:datastoreItem xmlns:ds="http://schemas.openxmlformats.org/officeDocument/2006/customXml" ds:itemID="{1279454D-02BE-4A9C-A117-DCD1573E2608}">
+<ds:datastoreItem xmlns:ds="http://schemas.openxmlformats.org/officeDocument/2006/customXml" ds:itemID="{EAE431FD-7059-4C09-804B-C9D69EB7B213}">
   <ds:schemaRefs>
-    <ds:schemaRef ds:uri="http://schemas.microsoft.com/office/2006/metadata/properties"/>
-    <ds:schemaRef ds:uri="http://schemas.microsoft.com/office/infopath/2007/PartnerControls"/>
-    <ds:schemaRef ds:uri="13c90a0b-73bc-4dc0-be5f-28d77b615beb"/>
-    <ds:schemaRef ds:uri="13c93bba-48ce-428c-bfe5-88b42c19b028"/>
+    <ds:schemaRef ds:uri="http://schemas.openxmlformats.org/officeDocument/2006/bibliography"/>
   </ds:schemaRefs>
 </ds:datastoreItem>
 </file>
@@ -20985,9 +21487,12 @@
 </file>
 
 <file path=customXml/itemProps4.xml><?xml version="1.0" encoding="utf-8"?>
-<ds:datastoreItem xmlns:ds="http://schemas.openxmlformats.org/officeDocument/2006/customXml" ds:itemID="{EAE431FD-7059-4C09-804B-C9D69EB7B213}">
+<ds:datastoreItem xmlns:ds="http://schemas.openxmlformats.org/officeDocument/2006/customXml" ds:itemID="{1279454D-02BE-4A9C-A117-DCD1573E2608}">
   <ds:schemaRefs>
-    <ds:schemaRef ds:uri="http://schemas.openxmlformats.org/officeDocument/2006/bibliography"/>
+    <ds:schemaRef ds:uri="http://schemas.microsoft.com/office/2006/metadata/properties"/>
+    <ds:schemaRef ds:uri="http://schemas.microsoft.com/office/infopath/2007/PartnerControls"/>
+    <ds:schemaRef ds:uri="13c90a0b-73bc-4dc0-be5f-28d77b615beb"/>
+    <ds:schemaRef ds:uri="13c93bba-48ce-428c-bfe5-88b42c19b028"/>
   </ds:schemaRefs>
 </ds:datastoreItem>
 </file>
</xml_diff>